<commit_message>
Add team members to Review 1, report and presentation; refresh zip
Co-Authored-By: Claude Opus 5.5 <noreply@anthropic.com>
Claude-Session: https://claude.ai/code/session_01RBCZvHRngDWn2z2Egxvtcp
</commit_message>
<xml_diff>
--- a/docs/VisionGuard_Project_Report.docx
+++ b/docs/VisionGuard_Project_Report.docx
@@ -103,22 +103,13 @@
         <w:jc w:val="center"/>
       </w:pPr>
       <w:r>
-        <w:t xml:space="preserve">Darshan S – </w:t>
-      </w:r>
-      <w:r>
-        <w:rPr>
-          <w:highlight w:val="yellow"/>
-        </w:rPr>
-        <w:t xml:space="preserve">[Registration number]</w:t>
+        <w:t xml:space="preserve">S Darshan – 25BCE2883</w:t>
       </w:r>
       <w:r>
         <w:br/>
       </w:r>
       <w:r>
-        <w:rPr>
-          <w:highlight w:val="yellow"/>
-        </w:rPr>
-        <w:t xml:space="preserve">[Team member 2 – Registration number, if any]</w:t>
+        <w:t xml:space="preserve">Tanay Agarwal – 25BCE2475</w:t>
       </w:r>
     </w:p>
     <w:p>
@@ -228,7 +219,7 @@
               <w:cnfStyle w:val="000000100000" w:firstRow="0" w:lastRow="0" w:firstColumn="0" w:lastColumn="0" w:oddVBand="0" w:evenVBand="0" w:oddHBand="1" w:evenHBand="0" w:firstRowFirstColumn="0" w:firstRowLastColumn="0" w:lastRowFirstColumn="0" w:lastRowLastColumn="0"/>
             </w:pPr>
             <w:r>
-              <w:t xml:space="preserve">Darshan S</w:t>
+              <w:t xml:space="preserve">S Darshan</w:t>
             </w:r>
           </w:p>
         </w:tc>
@@ -241,10 +232,7 @@
               <w:cnfStyle w:val="000000100000" w:firstRow="0" w:lastRow="0" w:firstColumn="0" w:lastColumn="0" w:oddVBand="0" w:evenVBand="0" w:oddHBand="1" w:evenHBand="0" w:firstRowFirstColumn="0" w:firstRowLastColumn="0" w:lastRowFirstColumn="0" w:lastRowLastColumn="0"/>
             </w:pPr>
             <w:r>
-              <w:rPr>
-                <w:highlight w:val="yellow"/>
-              </w:rPr>
-              <w:t xml:space="preserve">[Registration number]</w:t>
+              <w:t xml:space="preserve">25BCE2883</w:t>
             </w:r>
           </w:p>
         </w:tc>
@@ -270,10 +258,7 @@
               <w:cnfStyle w:val="000000000000" w:firstRow="0" w:lastRow="0" w:firstColumn="0" w:lastColumn="0" w:oddVBand="0" w:evenVBand="0" w:oddHBand="0" w:evenHBand="0" w:firstRowFirstColumn="0" w:firstRowLastColumn="0" w:lastRowFirstColumn="0" w:lastRowLastColumn="0"/>
             </w:pPr>
             <w:r>
-              <w:rPr>
-                <w:highlight w:val="yellow"/>
-              </w:rPr>
-              <w:t xml:space="preserve">[Team member, if any]</w:t>
+              <w:t xml:space="preserve">Tanay Agarwal</w:t>
             </w:r>
           </w:p>
         </w:tc>
@@ -286,10 +271,7 @@
               <w:cnfStyle w:val="000000000000" w:firstRow="0" w:lastRow="0" w:firstColumn="0" w:lastColumn="0" w:oddVBand="0" w:evenVBand="0" w:oddHBand="0" w:evenHBand="0" w:firstRowFirstColumn="0" w:firstRowLastColumn="0" w:lastRowFirstColumn="0" w:lastRowLastColumn="0"/>
             </w:pPr>
             <w:r>
-              <w:rPr>
-                <w:highlight w:val="yellow"/>
-              </w:rPr>
-              <w:t xml:space="preserve">[Registration number]</w:t>
+              <w:t xml:space="preserve">25BCE2475</w:t>
             </w:r>
           </w:p>
         </w:tc>

</xml_diff>

<commit_message>
Fill VIT Vellore B.Tech CSE details in submissions and presentation; refresh zip
Co-Authored-By: Claude Opus 5.5 <noreply@anthropic.com>
Claude-Session: https://claude.ai/code/session_01RBCZvHRngDWn2z2Egxvtcp
</commit_message>
<xml_diff>
--- a/docs/VisionGuard_Project_Report.docx
+++ b/docs/VisionGuard_Project_Report.docx
@@ -40,9 +40,8 @@
       <w:r>
         <w:rPr>
           <w:sz w:val="24"/>
-          <w:highlight w:val="yellow"/>
         </w:rPr>
-        <w:t xml:space="preserve">[Department / Programme]</w:t>
+        <w:t xml:space="preserve">School of Computer Science and Engineering (SCOPE) – B.Tech CSE</w:t>
       </w:r>
     </w:p>
     <w:p>
@@ -52,9 +51,8 @@
       <w:r>
         <w:rPr>
           <w:sz w:val="24"/>
-          <w:highlight w:val="yellow"/>
         </w:rPr>
-        <w:t xml:space="preserve">[Institution Name]</w:t>
+        <w:t xml:space="preserve">Vellore Institute of Technology, Vellore</w:t>
       </w:r>
     </w:p>
     <w:p>
@@ -76,9 +74,8 @@
       <w:r>
         <w:rPr>
           <w:sz w:val="24"/>
-          <w:highlight w:val="yellow"/>
         </w:rPr>
-        <w:t xml:space="preserve">[Academic Year and Semester]</w:t>
+        <w:t xml:space="preserve">Fall Semester 2026–27</w:t>
       </w:r>
     </w:p>
     <w:p>

</xml_diff>

<commit_message>
Fill slot, faculty and submission date; refresh zip
Co-Authored-By: Claude Opus 5.5 <noreply@anthropic.com>
Claude-Session: https://claude.ai/code/session_01RBCZvHRngDWn2z2Egxvtcp
</commit_message>
<xml_diff>
--- a/docs/VisionGuard_Project_Report.docx
+++ b/docs/VisionGuard_Project_Report.docx
@@ -115,10 +115,7 @@
         <w:jc w:val="center"/>
       </w:pPr>
       <w:r>
-        <w:rPr>
-          <w:highlight w:val="yellow"/>
-        </w:rPr>
-        <w:t xml:space="preserve">[Submission Date]</w:t>
+        <w:t xml:space="preserve">27 October 2026</w:t>
       </w:r>
     </w:p>
     <w:p>

</xml_diff>

<commit_message>
Restyle all documents: Times New Roman, plainer layout, simpler wording
Co-Authored-By: Claude Opus 5.5 <noreply@anthropic.com>
Claude-Session: https://claude.ai/code/session_01RBCZvHRngDWn2z2Egxvtcp
</commit_message>
<xml_diff>
--- a/docs/VisionGuard_Project_Report.docx
+++ b/docs/VisionGuard_Project_Report.docx
@@ -10,7 +10,7 @@
       <w:r>
         <w:rPr>
           <w:b/>
-          <w:color w:val="1F4E79"/>
+          <w:color w:val="000000"/>
           <w:sz w:val="56"/>
         </w:rPr>
         <w:t>VisionGuard: Smart Cane for Visually Impaired People</w:t>
@@ -298,7 +298,7 @@
         <w:t xml:space="preserve">50 cm</w:t>
       </w:r>
       <w:r>
-        <w:t xml:space="preserve"> using an HC-SR04 ultrasonic sensor (rated range 2–400 cm) and warn the user before contact.</w:t>
+        <w:t xml:space="preserve"> using an HC-SR04 ultrasonic sensor (range 2–400 cm), so the user is warned before hitting them.</w:t>
       </w:r>
     </w:p>
     <w:p>
@@ -306,7 +306,7 @@
         <w:pStyle w:val="ListBullet"/>
       </w:pPr>
       <w:r>
-        <w:t xml:space="preserve">Indicate how close the obstacle is through the beep rate: the gap between 50 ms beeps varies linearly from </w:t>
+        <w:t xml:space="preserve">Show how close the obstacle is through the beep speed: the gap between beeps goes from </w:t>
       </w:r>
       <w:r>
         <w:rPr>
@@ -332,16 +332,16 @@
         <w:pStyle w:val="ListBullet"/>
       </w:pPr>
       <w:r>
-        <w:t xml:space="preserve">Detect water or wet ground at the cane tip when the moisture reading falls below a calibrated threshold (default </w:t>
+        <w:t xml:space="preserve">Detect water or wet ground at the tip when the moisture reading drops below a set value (</w:t>
       </w:r>
       <w:r>
         <w:rPr>
           <w:b/>
         </w:rPr>
-        <w:t xml:space="preserve">500 of 1023</w:t>
+        <w:t xml:space="preserve">500 out of 1023</w:t>
       </w:r>
       <w:r>
-        <w:t xml:space="preserve">), with a continuous tone that takes </w:t>
+        <w:t xml:space="preserve">), and give a continuous tone that has </w:t>
       </w:r>
       <w:r>
         <w:rPr>
@@ -350,7 +350,7 @@
         <w:t xml:space="preserve">priority</w:t>
       </w:r>
       <w:r>
-        <w:t xml:space="preserve"> over obstacle alerts.</w:t>
+        <w:t xml:space="preserve"> over the obstacle beeps.</w:t>
       </w:r>
     </w:p>
     <w:p>
@@ -358,16 +358,16 @@
         <w:pStyle w:val="ListBullet"/>
       </w:pPr>
       <w:r>
-        <w:t xml:space="preserve">Keep the device portable and low-cost: powered by one </w:t>
+        <w:t xml:space="preserve">Keep the cane cheap and portable: it runs on one </w:t>
       </w:r>
       <w:r>
         <w:rPr>
           <w:b/>
         </w:rPr>
-        <w:t xml:space="preserve">18650 Li-ion cell</w:t>
+        <w:t xml:space="preserve">18650 battery</w:t>
       </w:r>
       <w:r>
-        <w:t xml:space="preserve"> with an on/off switch, with cane hardware costing </w:t>
+        <w:t xml:space="preserve"> with an on/off switch, and the cane parts cost </w:t>
       </w:r>
       <w:r>
         <w:rPr>
@@ -400,7 +400,7 @@
         <w:t xml:space="preserve">Input → processing → output.</w:t>
       </w:r>
       <w:r>
-        <w:t xml:space="preserve"> Two sensors are the inputs: the HC-SR04 ultrasonic module (distance ahead) and a resistive moisture probe with an LM393 module (wetness at the tip). The Arduino Nano (ATmega328P) is the processor: it times the echo, converts it to distance, reads the moisture voltage with its 10-bit ADC, and chooses an alert. The output is an active buzzer on pin D2. Everything runs from an 18650 cell connected through a rocker switch to the Nano’s 5V rail, which also powers both sensors.</w:t>
+        <w:t xml:space="preserve"> The cane has two inputs: the HC-SR04 ultrasonic sensor, which measures the distance in front, and a moisture probe with an LM393 module, which senses wetness at the tip. The Arduino Nano does the processing. It times the echo, works out the distance, reads the moisture voltage with its 10-bit ADC and decides which alert to give. The output is an active buzzer on pin D2. Everything is powered by one 18650 battery, connected through a rocker switch to the Nano's 5V pin, which also powers both sensors.</w:t>
       </w:r>
     </w:p>
     <w:p>
@@ -416,10 +416,10 @@
         <w:rPr>
           <w:b/>
         </w:rPr>
-        <w:t xml:space="preserve">(a) Ultrasonic echo ranging.</w:t>
+        <w:t xml:space="preserve">(a) Ultrasonic distance measurement.</w:t>
       </w:r>
       <w:r>
-        <w:t xml:space="preserve"> When the Nano holds the Trig pin HIGH for 10 µs, the HC-SR04 emits a burst of eight 40 kHz sound pulses. It then holds Echo HIGH until the reflection returns. The Echo pulse width t is the round-trip time, so the one-way distance is:</w:t>
+        <w:t xml:space="preserve"> The Nano sets the Trig pin HIGH for 10 µs. The HC-SR04 then sends out eight 40 kHz sound pulses and keeps the Echo pin HIGH until the echo comes back. The time Echo stays HIGH (t) is the time for the sound to reach the object and come back, so the distance is:</w:t>
       </w:r>
     </w:p>
     <w:p>
@@ -435,7 +435,7 @@
     </w:p>
     <w:p>
       <w:r>
-        <w:t xml:space="preserve">where v is the speed of sound, about 343 m/s at 20 °C (0.0343 cm/µs; the code uses 0.034). Example: t = 1000 µs gives d = 0.034 × 1000 / 2 = 17 cm. The speed of sound rises with air temperature T (v ≈ 331.3 + 0.606·T m/s), which adds an error of about 0.2% per °C. The sensor’s beam is a cone of about 15°, so it detects hard, flat surfaces facing it best. Soft or steeply angled surfaces can absorb or deflect the sound. A 30 ms pulseIn() timeout limits the measurement to about 5 m round trip.</w:t>
+        <w:t xml:space="preserve">Here v is the speed of sound, about 343 m/s at 20 °C, which is 0.0343 cm/µs (our code uses 0.034). For example, if t = 1000 µs, then d = 0.034 × 1000 / 2 = 17 cm. The speed of sound changes slightly with temperature (v ≈ 331.3 + 0.606·T m/s), which gives an error of about 0.2% per °C. The sensor's beam is a cone of about 15°, so it works best on hard, flat surfaces facing it. Soft or angled surfaces can absorb the sound or bounce it away. We set a 30 ms timeout in pulseIn(), which covers about 5 m there and back.</w:t>
       </w:r>
     </w:p>
     <w:p>
@@ -443,10 +443,10 @@
         <w:rPr>
           <w:b/>
         </w:rPr>
-        <w:t xml:space="preserve">(b) Resistive moisture sensing.</w:t>
+        <w:t xml:space="preserve">(b) Moisture sensing.</w:t>
       </w:r>
       <w:r>
-        <w:t xml:space="preserve"> The probe is two exposed copper tracks. Dry air between them is an insulator (very high resistance R_p). Water containing dissolved salts conducts, so R_p falls sharply. On the module, the probe forms a voltage divider with a fixed resistor R_f connected to the supply V_cc, and the A0 output is the divider midpoint:</w:t>
+        <w:t xml:space="preserve"> The probe has two bare copper tracks. Dry air between them does not conduct, so the resistance R_p is very high. Water has dissolved salts and conducts, so R_p drops a lot. On the module, the probe and a fixed resistor R_f form a voltage divider across V_cc, and the A0 pin gives the middle voltage:</w:t>
       </w:r>
     </w:p>
     <w:p>
@@ -462,7 +462,7 @@
     </w:p>
     <w:p>
       <w:r>
-        <w:t xml:space="preserve">N is the 10-bit ADC result. Dry gives R_p → ∞, so V_A0 ≈ V_cc and N ≈ 1023. Wet gives low R_p, so V_A0 and N drop. Because V_ref is the same supply that feeds the divider, the reading is ratiometric: N depends on the resistance ratio, not on the exact battery voltage. The LM393 comparator’s digital D0 output (threshold set by its potentiometer) is not used. The threshold is applied in software instead.</w:t>
+        <w:t xml:space="preserve">N is the 10-bit ADC value. When dry, R_p is very large, so V_A0 is close to V_cc and N is about 1023. When wet, R_p is small, so V_A0 and N go down. Since the ADC reference and the divider use the same supply, the reading depends on the resistance ratio and not on the exact battery voltage (it is ratiometric). We do not use the LM393's digital D0 output; we set the threshold in the code instead.</w:t>
       </w:r>
     </w:p>
     <w:p>
@@ -470,10 +470,10 @@
         <w:rPr>
           <w:b/>
         </w:rPr>
-        <w:t xml:space="preserve">(c) Sound output.</w:t>
+        <w:t xml:space="preserve">(c) Buzzer.</w:t>
       </w:r>
       <w:r>
-        <w:t xml:space="preserve"> The active buzzer contains its own oscillator and piezoelectric element. A DC voltage from a GPIO pin set HIGH makes the piezo disc vibrate at its resonant frequency (a few kHz), producing a tone.</w:t>
+        <w:t xml:space="preserve"> We use an active buzzer, which has its own oscillator and a piezo disc inside. When the GPIO pin goes HIGH, the disc vibrates at a few kHz and makes a tone.</w:t>
       </w:r>
     </w:p>
     <w:p>
@@ -484,7 +484,7 @@
         <w:t xml:space="preserve">(d) Power.</w:t>
       </w:r>
       <w:r>
-        <w:t xml:space="preserve"> The 18650 Li-ion cell gives 4.2 V when full and about 3.0 V when empty (3.7 V nominal). The ATmega328P and this HC-SR04 version both operate in this range. The electrolytic capacitor across the supply stores charge and supplies the short current pulses drawn when the buzzer switches (i = C·dV/dt), which limits voltage dips. At roughly 30–40 mA total current, a 1200 mAh cell gives a theoretical runtime of about 30 hours (1200 mAh ÷ 40 mA).</w:t>
+        <w:t xml:space="preserve"> The 18650 Li-ion cell is 4.2 V when full and about 3.0 V when empty (3.7 V nominal). The ATmega328P and our version of the HC-SR04 both work in this range. The capacitor across the supply stores charge and gives the extra current needed when the buzzer switches on (i = C·dV/dt), so the voltage does not dip much. The cane draws roughly 30–40 mA, so a 1200 mAh cell should last about 30 hours in theory (1200 mAh ÷ 40 mA).</w:t>
       </w:r>
     </w:p>
     <w:p>
@@ -503,10 +503,10 @@
         <w:rPr>
           <w:b/>
         </w:rPr>
-        <w:t xml:space="preserve">Initialise:</w:t>
+        <w:t xml:space="preserve">Start-up:</w:t>
       </w:r>
       <w:r>
-        <w:t xml:space="preserve"> set D5 (Trig), D2 (buzzer) and D3 (reserved vibration output) as outputs and D6 (Echo) as an input. Start Serial at 9600 baud and turn the buzzer OFF.</w:t>
+        <w:t xml:space="preserve"> set D5 (Trig), D2 (buzzer) and D3 (kept for the vibration motor) as outputs and D6 (Echo) as an input. Start Serial at 9600 baud and switch the buzzer off.</w:t>
       </w:r>
     </w:p>
     <w:p>
@@ -520,7 +520,7 @@
         <w:t xml:space="preserve">Measure distance:</w:t>
       </w:r>
       <w:r>
-        <w:t xml:space="preserve"> drive Trig LOW for 2 µs, HIGH for 10 µs, then LOW. Measure the Echo HIGH time t with pulseIn() (30 ms timeout; t = 0 if no echo). Compute d = t × 0.034 / 2 cm.</w:t>
+        <w:t xml:space="preserve"> make Trig LOW for 2 µs, HIGH for 10 µs, then LOW again. Measure how long Echo stays HIGH using pulseIn() with a 30 ms timeout (it returns 0 if there is no echo). Then d = t × 0.034 / 2 cm.</w:t>
       </w:r>
     </w:p>
     <w:p>
@@ -534,7 +534,7 @@
         <w:t xml:space="preserve">Read moisture:</w:t>
       </w:r>
       <w:r>
-        <w:t xml:space="preserve"> m = analogRead(A0), from 0 to 1023.</w:t>
+        <w:t xml:space="preserve"> m = analogRead(A0), which gives a value from 0 to 1023.</w:t>
       </w:r>
     </w:p>
     <w:p>
@@ -545,10 +545,10 @@
         <w:rPr>
           <w:b/>
         </w:rPr>
-        <w:t xml:space="preserve">Report:</w:t>
+        <w:t xml:space="preserve">Print:</w:t>
       </w:r>
       <w:r>
-        <w:t xml:space="preserve"> print d, m and the chosen state on the Serial Monitor.</w:t>
+        <w:t xml:space="preserve"> show d, m and the current state on the Serial Monitor.</w:t>
       </w:r>
     </w:p>
     <w:p>
@@ -559,10 +559,10 @@
         <w:rPr>
           <w:b/>
         </w:rPr>
-        <w:t xml:space="preserve">Decide (priority order):</w:t>
+        <w:t xml:space="preserve">Check water first:</w:t>
       </w:r>
       <w:r>
-        <w:t xml:space="preserve"> if m &lt; 500, go to the WATER state and turn the buzzer ON continuously.</w:t>
+        <w:t xml:space="preserve"> if m &lt; 500, go to the WATER state and keep the buzzer ON.</w:t>
       </w:r>
     </w:p>
     <w:p>
@@ -570,7 +570,7 @@
         <w:pStyle w:val="ListNumber"/>
       </w:pPr>
       <w:r>
-        <w:t xml:space="preserve">Else if 0 &lt; d &lt; 50 cm, go to the OBSTACLE state. Clamp d to 2–50 cm (dc), compute the gap g = map(dc, 2, 50, 50, 400) ms, sound the buzzer for 50 ms, then stay silent for g ms. A closer obstacle gives a shorter gap, so the beeps come faster.</w:t>
+        <w:t xml:space="preserve">If not, and 0 &lt; d &lt; 50 cm, go to the OBSTACLE state. Limit d to 2–50 cm, find the gap g = map(d, 2, 50, 50, 400) ms, beep for 50 ms and then stay quiet for g ms. A closer obstacle gives a shorter gap, so the beeps get faster.</w:t>
       </w:r>
     </w:p>
     <w:p>
@@ -578,7 +578,7 @@
         <w:pStyle w:val="ListNumber"/>
       </w:pPr>
       <w:r>
-        <w:t xml:space="preserve">Otherwise (d = 0, meaning no echo, or d ≥ 50 cm), go to the CLEAR state and turn the buzzer OFF.</w:t>
+        <w:t xml:space="preserve">Otherwise (d = 0, meaning no echo, or d ≥ 50 cm), go to the CLEAR state and turn the buzzer off.</w:t>
       </w:r>
     </w:p>
     <w:p>
@@ -592,7 +592,7 @@
         <w:t xml:space="preserve">Repeat:</w:t>
       </w:r>
       <w:r>
-        <w:t xml:space="preserve"> wait 30 ms so the previous echo dies out, then return to step 2. The loop runs continuously while the cane is switched on.</w:t>
+        <w:t xml:space="preserve"> wait 30 ms so the old echo dies out, then go back to step 2. This keeps running as long as the cane is on.</w:t>
       </w:r>
     </w:p>
     <w:p>
@@ -600,10 +600,10 @@
         <w:rPr>
           <w:b/>
         </w:rPr>
-        <w:t xml:space="preserve">Expected responses:</w:t>
+        <w:t xml:space="preserve">What should happen:</w:t>
       </w:r>
       <w:r>
-        <w:t xml:space="preserve"> open space gives silence. A hand moving from 60 cm toward the sensor starts beeping at 50 cm, and the beeps get faster as it approaches. Dipping the tip in water gives a continuous tone, even when an obstacle is also present.</w:t>
+        <w:t xml:space="preserve"> in open space the cane stays quiet. When a hand moves in from 60 cm, the beeping starts at 50 cm and gets faster as the hand comes closer. When the tip is dipped in water, the tone becomes continuous, even if there is also an obstacle in front.</w:t>
       </w:r>
     </w:p>
     <w:p>
@@ -671,7 +671,7 @@
     </w:p>
     <w:p>
       <w:r>
-        <w:t xml:space="preserve">The echo time t passes through two arithmetic operations (× 0.034, ÷ 2) to give the distance d. The distance feeds two independent branches: a range comparison (near) and a clamp-and-map that produces the beep gap g. The ADC value m is compared with the threshold to give wet. The priority-select node combines wet, near and g to drive the buzzer. Because the two sensor paths do not depend on each other, they could be computed in either order.</w:t>
+        <w:t xml:space="preserve">The echo time t goes through two steps (× 0.034 and ÷ 2) to give the distance d. The distance is then used in two places: a check for whether the obstacle is near, and the constrain and map steps that give the beep gap g. The moisture value m is compared with 500 to decide whether it is wet. The priority block takes wet, near and g and controls the buzzer. The two sensor paths do not depend on each other, so they can be worked out in any order.</w:t>
       </w:r>
     </w:p>
     <w:p>
@@ -739,7 +739,7 @@
     </w:p>
     <w:p>
       <w:r>
-        <w:t xml:space="preserve">After power-on, the system initialises once and then cycles through SENSE on every loop. From SENSE it enters exactly one output state: WATER (m &lt; 500), OBSTACLE (m ≥ 500 and 0 &lt; d &lt; 50 cm) or CLEAR (otherwise). Each output state returns to SENSE after the 30 ms loop delay. Turning the rocker switch off returns the system to OFF from any state.</w:t>
+        <w:t xml:space="preserve">When the cane is switched on, it sets up once and then goes to SENSE in every loop. From SENSE it goes to exactly one of three states: WATER (m &lt; 500), OBSTACLE (m ≥ 500 and 0 &lt; d &lt; 50 cm) or CLEAR (everything else). Each of these goes back to SENSE after the 30 ms delay. Turning the switch off takes it back to OFF from any state.</w:t>
       </w:r>
     </w:p>
     <w:p>
@@ -834,7 +834,7 @@
         <w:tc>
           <w:tcPr>
             <w:tcW w:w="3300" w:type="dxa"/>
-            <w:shd w:val="clear" w:color="auto" w:fill="D9EAF7"/>
+            <w:shd w:val="clear" w:color="auto" w:fill="E7E6E6"/>
           </w:tcPr>
           <w:p>
             <w:r>
@@ -849,7 +849,7 @@
         <w:tc>
           <w:tcPr>
             <w:tcW w:w="2700" w:type="dxa"/>
-            <w:shd w:val="clear" w:color="auto" w:fill="D9EAF7"/>
+            <w:shd w:val="clear" w:color="auto" w:fill="E7E6E6"/>
           </w:tcPr>
           <w:p>
             <w:r>
@@ -864,7 +864,7 @@
         <w:tc>
           <w:tcPr>
             <w:tcW w:w="3792" w:type="dxa"/>
-            <w:shd w:val="clear" w:color="auto" w:fill="D9EAF7"/>
+            <w:shd w:val="clear" w:color="auto" w:fill="E7E6E6"/>
           </w:tcPr>
           <w:p>
             <w:r>
@@ -1568,10 +1568,7 @@
         <w:pStyle w:val="ListBullet"/>
       </w:pPr>
       <w:r>
-        <w:t xml:space="preserve">Objectives achieved:</w:t>
-      </w:r>
-      <w:r>
-        <w:t xml:space="preserve"> on battery power, the cane beeps when an obstacle comes within 50 cm, and the beep rate increases as the obstacle approaches (Objectives 1 and 2, checked by moving a hand or notebook toward the sensor while watching the distance on the Serial Monitor). The water alert (Objective 3) is implemented with priority over obstacle alerts; dry reading ≈ </w:t>
+        <w:t xml:space="preserve">Objectives achieved: On battery power the cane beeps when an obstacle comes within 50 cm, and the beeps get faster as it comes closer (objectives 1 and 2). We checked this by moving a hand or a notebook towards the sensor while watching the distance on the Serial Monitor. The water alert (objective 3) works in the code and has priority over obstacles; dry reading ≈ </w:t>
       </w:r>
       <w:r>
         <w:rPr>
@@ -1598,10 +1595,7 @@
         <w:t xml:space="preserve">value</w:t>
       </w:r>
       <w:r>
-        <w:t xml:space="preserve">. The cane runs from a single 18650 cell with a rocker switch, and the cane hardware cost ₹876 (Objective 4).</w:t>
-      </w:r>
-      <w:r>
-        <w:t xml:space="preserve"/>
+        <w:t xml:space="preserve">. The cane runs on one 18650 cell with a switch, and the cane parts cost ₹876 (objective 4).</w:t>
       </w:r>
     </w:p>
     <w:p>
@@ -1609,13 +1603,7 @@
         <w:pStyle w:val="ListBullet"/>
       </w:pPr>
       <w:r>
-        <w:t xml:space="preserve">Challenges faced:</w:t>
-      </w:r>
-      <w:r>
-        <w:t xml:space="preserve"> the single 3.7 V cell feeds the 5V rail with no regulation, so readings can become unreliable as the cell discharges. The ultrasonic beam misses thin, soft and head-level obstacles. In the original code, a missed echo blocked the loop for up to 1 s (the default pulseIn() timeout); a 30 ms timeout fixed this. The moisture threshold must be calibrated for each probe.</w:t>
-      </w:r>
-      <w:r>
-        <w:t xml:space="preserve"/>
+        <w:t xml:space="preserve">Challenges faced: The 3.7 V cell is connected straight to the 5V pin without a regulator, so the readings can become unreliable as the battery runs down. The ultrasonic beam misses thin, soft and head-level objects. In the first version of the code, a missed echo stopped the loop for up to 1 second because of the default pulseIn() timeout; we fixed this with a 30 ms timeout. The moisture threshold also has to be set separately for each probe.</w:t>
       </w:r>
     </w:p>
     <w:p>
@@ -1623,13 +1611,7 @@
         <w:pStyle w:val="ListBullet"/>
       </w:pPr>
       <w:r>
-        <w:t xml:space="preserve">Improvements:</w:t>
-      </w:r>
-      <w:r>
-        <w:t xml:space="preserve"> add a 5 V boost converter, a TP4056 charging module and the 1 A fuse for stable, protected power. Average several distance readings and add temperature compensation for accuracy. Replace the resistive probe with a capacitive one to stop corrosion. Add a vibration motor (via the IRLZ44N MOSFET) for silent alerts that work in noise. Move the wiring onto a PCB inside a waterproof enclosure.</w:t>
-      </w:r>
-      <w:r>
-        <w:t xml:space="preserve"/>
+        <w:t xml:space="preserve">Improvements: Add a 5 V boost converter, a TP4056 charging module and the 1 A fuse for steady, safe power. Average a few distance readings and correct for temperature to improve accuracy. Use a capacitive moisture sensor so the probe does not corrode. Add a vibration motor (through the IRLZ44N MOSFET) so alerts can be felt in noisy places. Move the circuit onto a PCB inside a waterproof box.</w:t>
       </w:r>
     </w:p>
     <w:p>
@@ -1637,18 +1619,12 @@
         <w:pStyle w:val="ListBullet"/>
       </w:pPr>
       <w:r>
-        <w:t xml:space="preserve">Future scope:</w:t>
-      </w:r>
-      <w:r>
-        <w:t xml:space="preserve"> add extra ultrasonic sensors angled up (head-level obstacles) and down (steps and potholes), GPS with GSM or Bluetooth for an SOS message to family, a low-battery warning, and field trials with visually impaired users to tune the alert distance (for example 100–150 cm).</w:t>
-      </w:r>
-      <w:r>
-        <w:t xml:space="preserve"/>
+        <w:t xml:space="preserve">Future scope: Add more ultrasonic sensors pointing up (for head-level objects) and down (for steps and potholes), GPS with GSM or Bluetooth to send an SOS message to family, a low-battery warning, and trials with visually impaired users to find the best alert distance (for example 100–150 cm).</w:t>
       </w:r>
     </w:p>
     <w:p>
       <w:r>
-        <w:t xml:space="preserve">VisionGuard shows that an Arduino Nano, an ultrasonic sensor and a resistive moisture probe can turn a plain cane into a low-cost electronic travel aid. It warns about obstacles before contact, encodes distance in the beep rate, and gives priority warnings for water underfoot, all from a single rechargeable cell. The prototype meets its core sensing and alerting objectives in bench tests. The main improvements identified are regulated, protected power, haptic feedback and wider sensing coverage, which together would make the cane ready for real-world trials.</w:t>
+        <w:t xml:space="preserve">VisionGuard shows that a plain cane can be turned into a cheap electronic travel aid using an Arduino Nano, an ultrasonic sensor and a moisture probe. It warns about obstacles before the user touches them, shows the distance through the beep speed, and gives a priority warning for water, all from one rechargeable battery. The prototype meets its main objectives in our bench tests. The main things to improve are regulated and protected power, vibration feedback and wider sensing, which would make it ready for real-world testing.</w:t>
       </w:r>
     </w:p>
     <w:p>
@@ -2023,7 +1999,7 @@
   <w:docDefaults>
     <w:rPrDefault>
       <w:rPr>
-        <w:rFonts w:asciiTheme="minorHAnsi" w:eastAsiaTheme="minorEastAsia" w:hAnsiTheme="minorHAnsi" w:cstheme="minorBidi"/>
+        <w:rFonts w:ascii="Times New Roman" w:hAnsi="Times New Roman" w:cs="Times New Roman" w:eastAsia="Times New Roman"/>
         <w:sz w:val="22"/>
         <w:szCs w:val="22"/>
         <w:lang w:val="en-US" w:eastAsia="en-US" w:bidi="ar-SA"/>
@@ -2412,8 +2388,8 @@
       <w:spacing w:after="100"/>
     </w:pPr>
     <w:rPr>
-      <w:rFonts w:ascii="Calibri" w:hAnsi="Calibri"/>
-      <w:sz w:val="21"/>
+      <w:rFonts w:ascii="Times New Roman" w:hAnsi="Times New Roman" w:cs="Times New Roman" w:eastAsia="Times New Roman"/>
+      <w:sz w:val="24"/>
     </w:rPr>
   </w:style>
   <w:style w:type="paragraph" w:styleId="Heading1">
@@ -2431,10 +2407,10 @@
       <w:outlineLvl w:val="0"/>
     </w:pPr>
     <w:rPr>
-      <w:rFonts w:asciiTheme="majorHAnsi" w:eastAsiaTheme="majorEastAsia" w:hAnsiTheme="majorHAnsi" w:cstheme="majorBidi"/>
+      <w:rFonts w:ascii="Times New Roman" w:hAnsi="Times New Roman" w:cs="Times New Roman" w:eastAsia="Times New Roman"/>
       <w:b/>
       <w:bCs/>
-      <w:color w:val="1F4E79"/>
+      <w:color w:val="000000"/>
       <w:sz w:val="32"/>
       <w:szCs w:val="28"/>
     </w:rPr>
@@ -2455,10 +2431,10 @@
       <w:outlineLvl w:val="1"/>
     </w:pPr>
     <w:rPr>
-      <w:rFonts w:asciiTheme="majorHAnsi" w:eastAsiaTheme="majorEastAsia" w:hAnsiTheme="majorHAnsi" w:cstheme="majorBidi"/>
+      <w:rFonts w:ascii="Times New Roman" w:hAnsi="Times New Roman" w:cs="Times New Roman" w:eastAsia="Times New Roman"/>
       <w:b/>
       <w:bCs/>
-      <w:color w:val="1F4E79"/>
+      <w:color w:val="000000"/>
       <w:sz w:val="24"/>
       <w:szCs w:val="26"/>
     </w:rPr>
@@ -2479,7 +2455,7 @@
       <w:outlineLvl w:val="2"/>
     </w:pPr>
     <w:rPr>
-      <w:rFonts w:asciiTheme="majorHAnsi" w:eastAsiaTheme="majorEastAsia" w:hAnsiTheme="majorHAnsi" w:cstheme="majorBidi"/>
+      <w:rFonts w:ascii="Times New Roman" w:hAnsi="Times New Roman" w:cs="Times New Roman" w:eastAsia="Times New Roman"/>
       <w:b/>
       <w:bCs/>
       <w:color w:val="4F81BD" w:themeColor="accent1"/>
@@ -2502,7 +2478,7 @@
       <w:outlineLvl w:val="3"/>
     </w:pPr>
     <w:rPr>
-      <w:rFonts w:asciiTheme="majorHAnsi" w:eastAsiaTheme="majorEastAsia" w:hAnsiTheme="majorHAnsi" w:cstheme="majorBidi"/>
+      <w:rFonts w:ascii="Times New Roman" w:hAnsi="Times New Roman" w:cs="Times New Roman" w:eastAsia="Times New Roman"/>
       <w:b/>
       <w:bCs/>
       <w:i/>
@@ -2527,7 +2503,7 @@
       <w:outlineLvl w:val="4"/>
     </w:pPr>
     <w:rPr>
-      <w:rFonts w:asciiTheme="majorHAnsi" w:eastAsiaTheme="majorEastAsia" w:hAnsiTheme="majorHAnsi" w:cstheme="majorBidi"/>
+      <w:rFonts w:ascii="Times New Roman" w:hAnsi="Times New Roman" w:cs="Times New Roman" w:eastAsia="Times New Roman"/>
       <w:color w:val="243F60" w:themeColor="accent1" w:themeShade="7F"/>
     </w:rPr>
   </w:style>
@@ -2548,7 +2524,7 @@
       <w:outlineLvl w:val="5"/>
     </w:pPr>
     <w:rPr>
-      <w:rFonts w:asciiTheme="majorHAnsi" w:eastAsiaTheme="majorEastAsia" w:hAnsiTheme="majorHAnsi" w:cstheme="majorBidi"/>
+      <w:rFonts w:ascii="Times New Roman" w:hAnsi="Times New Roman" w:cs="Times New Roman" w:eastAsia="Times New Roman"/>
       <w:i/>
       <w:iCs/>
       <w:color w:val="243F60" w:themeColor="accent1" w:themeShade="7F"/>
@@ -2571,7 +2547,7 @@
       <w:outlineLvl w:val="6"/>
     </w:pPr>
     <w:rPr>
-      <w:rFonts w:asciiTheme="majorHAnsi" w:eastAsiaTheme="majorEastAsia" w:hAnsiTheme="majorHAnsi" w:cstheme="majorBidi"/>
+      <w:rFonts w:ascii="Times New Roman" w:hAnsi="Times New Roman" w:cs="Times New Roman" w:eastAsia="Times New Roman"/>
       <w:i/>
       <w:iCs/>
       <w:color w:val="404040" w:themeColor="text1" w:themeTint="BF"/>
@@ -2594,7 +2570,7 @@
       <w:outlineLvl w:val="7"/>
     </w:pPr>
     <w:rPr>
-      <w:rFonts w:asciiTheme="majorHAnsi" w:eastAsiaTheme="majorEastAsia" w:hAnsiTheme="majorHAnsi" w:cstheme="majorBidi"/>
+      <w:rFonts w:ascii="Times New Roman" w:hAnsi="Times New Roman" w:cs="Times New Roman" w:eastAsia="Times New Roman"/>
       <w:color w:val="4F81BD" w:themeColor="accent1"/>
       <w:sz w:val="20"/>
       <w:szCs w:val="20"/>
@@ -2617,7 +2593,7 @@
       <w:outlineLvl w:val="8"/>
     </w:pPr>
     <w:rPr>
-      <w:rFonts w:asciiTheme="majorHAnsi" w:eastAsiaTheme="majorEastAsia" w:hAnsiTheme="majorHAnsi" w:cstheme="majorBidi"/>
+      <w:rFonts w:ascii="Times New Roman" w:hAnsi="Times New Roman" w:cs="Times New Roman" w:eastAsia="Times New Roman"/>
       <w:i/>
       <w:iCs/>
       <w:color w:val="404040" w:themeColor="text1" w:themeTint="BF"/>
@@ -2712,7 +2688,7 @@
     <w:uiPriority w:val="9"/>
     <w:rsid w:val="00FC693F"/>
     <w:rPr>
-      <w:rFonts w:asciiTheme="majorHAnsi" w:eastAsiaTheme="majorEastAsia" w:hAnsiTheme="majorHAnsi" w:cstheme="majorBidi"/>
+      <w:rFonts w:ascii="Times New Roman" w:hAnsi="Times New Roman" w:cs="Times New Roman" w:eastAsia="Times New Roman"/>
       <w:b/>
       <w:bCs/>
       <w:color w:val="365F91" w:themeColor="accent1" w:themeShade="BF"/>
@@ -2727,7 +2703,7 @@
     <w:uiPriority w:val="9"/>
     <w:rsid w:val="00FC693F"/>
     <w:rPr>
-      <w:rFonts w:asciiTheme="majorHAnsi" w:eastAsiaTheme="majorEastAsia" w:hAnsiTheme="majorHAnsi" w:cstheme="majorBidi"/>
+      <w:rFonts w:ascii="Times New Roman" w:hAnsi="Times New Roman" w:cs="Times New Roman" w:eastAsia="Times New Roman"/>
       <w:b/>
       <w:bCs/>
       <w:color w:val="4F81BD" w:themeColor="accent1"/>
@@ -2742,7 +2718,7 @@
     <w:uiPriority w:val="9"/>
     <w:rsid w:val="00FC693F"/>
     <w:rPr>
-      <w:rFonts w:asciiTheme="majorHAnsi" w:eastAsiaTheme="majorEastAsia" w:hAnsiTheme="majorHAnsi" w:cstheme="majorBidi"/>
+      <w:rFonts w:ascii="Times New Roman" w:hAnsi="Times New Roman" w:cs="Times New Roman" w:eastAsia="Times New Roman"/>
       <w:b/>
       <w:bCs/>
       <w:color w:val="4F81BD" w:themeColor="accent1"/>
@@ -2758,15 +2734,15 @@
     <w:rsid w:val="00FC693F"/>
     <w:pPr>
       <w:pBdr>
-        <w:bottom w:val="single" w:sz="8" w:space="4" w:color="4F81BD" w:themeColor="accent1"/>
+        <w:bottom w:val="single" w:sz="8" w:space="4" w:color="000000"/>
       </w:pBdr>
       <w:spacing w:after="300" w:line="240" w:lineRule="auto"/>
       <w:contextualSpacing/>
     </w:pPr>
     <w:rPr>
-      <w:rFonts w:asciiTheme="majorHAnsi" w:eastAsiaTheme="majorEastAsia" w:hAnsiTheme="majorHAnsi" w:cstheme="majorBidi"/>
+      <w:rFonts w:ascii="Times New Roman" w:hAnsi="Times New Roman" w:cs="Times New Roman" w:eastAsia="Times New Roman"/>
       <w:b/>
-      <w:color w:val="1F4E79"/>
+      <w:color w:val="000000"/>
       <w:spacing w:val="5"/>
       <w:kern w:val="28"/>
       <w:sz w:val="52"/>
@@ -2780,7 +2756,7 @@
     <w:uiPriority w:val="10"/>
     <w:rsid w:val="00FC693F"/>
     <w:rPr>
-      <w:rFonts w:asciiTheme="majorHAnsi" w:eastAsiaTheme="majorEastAsia" w:hAnsiTheme="majorHAnsi" w:cstheme="majorBidi"/>
+      <w:rFonts w:ascii="Times New Roman" w:hAnsi="Times New Roman" w:cs="Times New Roman" w:eastAsia="Times New Roman"/>
       <w:color w:val="17365D" w:themeColor="text2" w:themeShade="BF"/>
       <w:spacing w:val="5"/>
       <w:kern w:val="28"/>
@@ -2802,7 +2778,7 @@
       </w:numPr>
     </w:pPr>
     <w:rPr>
-      <w:rFonts w:asciiTheme="majorHAnsi" w:eastAsiaTheme="majorEastAsia" w:hAnsiTheme="majorHAnsi" w:cstheme="majorBidi"/>
+      <w:rFonts w:ascii="Times New Roman" w:hAnsi="Times New Roman" w:cs="Times New Roman" w:eastAsia="Times New Roman"/>
       <w:i/>
       <w:iCs/>
       <w:color w:val="4F81BD" w:themeColor="accent1"/>
@@ -2818,7 +2794,7 @@
     <w:uiPriority w:val="11"/>
     <w:rsid w:val="00FC693F"/>
     <w:rPr>
-      <w:rFonts w:asciiTheme="majorHAnsi" w:eastAsiaTheme="majorEastAsia" w:hAnsiTheme="majorHAnsi" w:cstheme="majorBidi"/>
+      <w:rFonts w:ascii="Times New Roman" w:hAnsi="Times New Roman" w:cs="Times New Roman" w:eastAsia="Times New Roman"/>
       <w:i/>
       <w:iCs/>
       <w:color w:val="4F81BD" w:themeColor="accent1"/>
@@ -3065,7 +3041,7 @@
       </w:tabs>
     </w:pPr>
     <w:rPr>
-      <w:rFonts w:ascii="Courier" w:hAnsi="Courier"/>
+      <w:rFonts w:ascii="Times New Roman" w:hAnsi="Times New Roman" w:cs="Times New Roman" w:eastAsia="Times New Roman"/>
       <w:sz w:val="20"/>
       <w:szCs w:val="20"/>
     </w:rPr>
@@ -3077,7 +3053,7 @@
     <w:uiPriority w:val="99"/>
     <w:rsid w:val="0029639D"/>
     <w:rPr>
-      <w:rFonts w:ascii="Courier" w:hAnsi="Courier"/>
+      <w:rFonts w:ascii="Times New Roman" w:hAnsi="Times New Roman" w:cs="Times New Roman" w:eastAsia="Times New Roman"/>
       <w:sz w:val="20"/>
       <w:szCs w:val="20"/>
     </w:rPr>
@@ -3116,7 +3092,7 @@
     <w:semiHidden/>
     <w:rsid w:val="00FC693F"/>
     <w:rPr>
-      <w:rFonts w:asciiTheme="majorHAnsi" w:eastAsiaTheme="majorEastAsia" w:hAnsiTheme="majorHAnsi" w:cstheme="majorBidi"/>
+      <w:rFonts w:ascii="Times New Roman" w:hAnsi="Times New Roman" w:cs="Times New Roman" w:eastAsia="Times New Roman"/>
       <w:b/>
       <w:bCs/>
       <w:i/>
@@ -3132,7 +3108,7 @@
     <w:semiHidden/>
     <w:rsid w:val="00FC693F"/>
     <w:rPr>
-      <w:rFonts w:asciiTheme="majorHAnsi" w:eastAsiaTheme="majorEastAsia" w:hAnsiTheme="majorHAnsi" w:cstheme="majorBidi"/>
+      <w:rFonts w:ascii="Times New Roman" w:hAnsi="Times New Roman" w:cs="Times New Roman" w:eastAsia="Times New Roman"/>
       <w:color w:val="243F60" w:themeColor="accent1" w:themeShade="7F"/>
     </w:rPr>
   </w:style>
@@ -3144,7 +3120,7 @@
     <w:semiHidden/>
     <w:rsid w:val="00FC693F"/>
     <w:rPr>
-      <w:rFonts w:asciiTheme="majorHAnsi" w:eastAsiaTheme="majorEastAsia" w:hAnsiTheme="majorHAnsi" w:cstheme="majorBidi"/>
+      <w:rFonts w:ascii="Times New Roman" w:hAnsi="Times New Roman" w:cs="Times New Roman" w:eastAsia="Times New Roman"/>
       <w:i/>
       <w:iCs/>
       <w:color w:val="243F60" w:themeColor="accent1" w:themeShade="7F"/>
@@ -3158,7 +3134,7 @@
     <w:semiHidden/>
     <w:rsid w:val="00FC693F"/>
     <w:rPr>
-      <w:rFonts w:asciiTheme="majorHAnsi" w:eastAsiaTheme="majorEastAsia" w:hAnsiTheme="majorHAnsi" w:cstheme="majorBidi"/>
+      <w:rFonts w:ascii="Times New Roman" w:hAnsi="Times New Roman" w:cs="Times New Roman" w:eastAsia="Times New Roman"/>
       <w:i/>
       <w:iCs/>
       <w:color w:val="404040" w:themeColor="text1" w:themeTint="BF"/>
@@ -3172,7 +3148,7 @@
     <w:semiHidden/>
     <w:rsid w:val="00FC693F"/>
     <w:rPr>
-      <w:rFonts w:asciiTheme="majorHAnsi" w:eastAsiaTheme="majorEastAsia" w:hAnsiTheme="majorHAnsi" w:cstheme="majorBidi"/>
+      <w:rFonts w:ascii="Times New Roman" w:hAnsi="Times New Roman" w:cs="Times New Roman" w:eastAsia="Times New Roman"/>
       <w:color w:val="4F81BD" w:themeColor="accent1"/>
       <w:sz w:val="20"/>
       <w:szCs w:val="20"/>
@@ -3186,7 +3162,7 @@
     <w:semiHidden/>
     <w:rsid w:val="00FC693F"/>
     <w:rPr>
-      <w:rFonts w:asciiTheme="majorHAnsi" w:eastAsiaTheme="majorEastAsia" w:hAnsiTheme="majorHAnsi" w:cstheme="majorBidi"/>
+      <w:rFonts w:ascii="Times New Roman" w:hAnsi="Times New Roman" w:cs="Times New Roman" w:eastAsia="Times New Roman"/>
       <w:i/>
       <w:iCs/>
       <w:color w:val="404040" w:themeColor="text1" w:themeTint="BF"/>
@@ -3246,7 +3222,7 @@
     <w:rsid w:val="00FC693F"/>
     <w:pPr>
       <w:pBdr>
-        <w:bottom w:val="single" w:sz="4" w:space="4" w:color="4F81BD" w:themeColor="accent1"/>
+        <w:bottom w:val="single" w:sz="4" w:space="4" w:color="000000"/>
       </w:pBdr>
       <w:spacing w:before="200" w:after="280"/>
       <w:ind w:left="936" w:right="936"/>
@@ -3482,8 +3458,8 @@
       <w:tblStyleRowBandSize w:val="1"/>
       <w:tblStyleColBandSize w:val="1"/>
       <w:tblBorders>
-        <w:top w:val="single" w:sz="8" w:space="0" w:color="4F81BD" w:themeColor="accent1"/>
-        <w:bottom w:val="single" w:sz="8" w:space="0" w:color="4F81BD" w:themeColor="accent1"/>
+        <w:top w:val="single" w:sz="8" w:space="0" w:color="000000"/>
+        <w:bottom w:val="single" w:sz="8" w:space="0" w:color="000000"/>
       </w:tblBorders>
     </w:tblPr>
     <w:tblStylePr w:type="firstRow">
@@ -3497,9 +3473,9 @@
       <w:tblPr/>
       <w:tcPr>
         <w:tcBorders>
-          <w:top w:val="single" w:sz="8" w:space="0" w:color="4F81BD" w:themeColor="accent1"/>
-          <w:left w:val="nil"/>
-          <w:bottom w:val="single" w:sz="8" w:space="0" w:color="4F81BD" w:themeColor="accent1"/>
+          <w:top w:val="single" w:sz="8" w:space="0" w:color="000000"/>
+          <w:left w:val="nil"/>
+          <w:bottom w:val="single" w:sz="8" w:space="0" w:color="000000"/>
           <w:right w:val="nil"/>
           <w:insideH w:val="nil"/>
           <w:insideV w:val="nil"/>
@@ -3517,9 +3493,9 @@
       <w:tblPr/>
       <w:tcPr>
         <w:tcBorders>
-          <w:top w:val="single" w:sz="8" w:space="0" w:color="4F81BD" w:themeColor="accent1"/>
-          <w:left w:val="nil"/>
-          <w:bottom w:val="single" w:sz="8" w:space="0" w:color="4F81BD" w:themeColor="accent1"/>
+          <w:top w:val="single" w:sz="8" w:space="0" w:color="000000"/>
+          <w:left w:val="nil"/>
+          <w:bottom w:val="single" w:sz="8" w:space="0" w:color="000000"/>
           <w:right w:val="nil"/>
           <w:insideH w:val="nil"/>
           <w:insideV w:val="nil"/>
@@ -4140,10 +4116,10 @@
       <w:tblStyleRowBandSize w:val="1"/>
       <w:tblStyleColBandSize w:val="1"/>
       <w:tblBorders>
-        <w:top w:val="single" w:sz="8" w:space="0" w:color="4F81BD" w:themeColor="accent1"/>
-        <w:left w:val="single" w:sz="8" w:space="0" w:color="4F81BD" w:themeColor="accent1"/>
-        <w:bottom w:val="single" w:sz="8" w:space="0" w:color="4F81BD" w:themeColor="accent1"/>
-        <w:right w:val="single" w:sz="8" w:space="0" w:color="4F81BD" w:themeColor="accent1"/>
+        <w:top w:val="single" w:sz="8" w:space="0" w:color="000000"/>
+        <w:left w:val="single" w:sz="8" w:space="0" w:color="000000"/>
+        <w:bottom w:val="single" w:sz="8" w:space="0" w:color="000000"/>
+        <w:right w:val="single" w:sz="8" w:space="0" w:color="000000"/>
       </w:tblBorders>
     </w:tblPr>
     <w:tblStylePr w:type="firstRow">
@@ -4171,10 +4147,10 @@
       <w:tblPr/>
       <w:tcPr>
         <w:tcBorders>
-          <w:top w:val="double" w:sz="6" w:space="0" w:color="4F81BD" w:themeColor="accent1"/>
-          <w:left w:val="single" w:sz="8" w:space="0" w:color="4F81BD" w:themeColor="accent1"/>
-          <w:bottom w:val="single" w:sz="8" w:space="0" w:color="4F81BD" w:themeColor="accent1"/>
-          <w:right w:val="single" w:sz="8" w:space="0" w:color="4F81BD" w:themeColor="accent1"/>
+          <w:top w:val="double" w:sz="6" w:space="0" w:color="000000"/>
+          <w:left w:val="single" w:sz="8" w:space="0" w:color="000000"/>
+          <w:bottom w:val="single" w:sz="8" w:space="0" w:color="000000"/>
+          <w:right w:val="single" w:sz="8" w:space="0" w:color="000000"/>
         </w:tcBorders>
       </w:tcPr>
     </w:tblStylePr>
@@ -4194,10 +4170,10 @@
       <w:tblPr/>
       <w:tcPr>
         <w:tcBorders>
-          <w:top w:val="single" w:sz="8" w:space="0" w:color="4F81BD" w:themeColor="accent1"/>
-          <w:left w:val="single" w:sz="8" w:space="0" w:color="4F81BD" w:themeColor="accent1"/>
-          <w:bottom w:val="single" w:sz="8" w:space="0" w:color="4F81BD" w:themeColor="accent1"/>
-          <w:right w:val="single" w:sz="8" w:space="0" w:color="4F81BD" w:themeColor="accent1"/>
+          <w:top w:val="single" w:sz="8" w:space="0" w:color="000000"/>
+          <w:left w:val="single" w:sz="8" w:space="0" w:color="000000"/>
+          <w:bottom w:val="single" w:sz="8" w:space="0" w:color="000000"/>
+          <w:right w:val="single" w:sz="8" w:space="0" w:color="000000"/>
         </w:tcBorders>
       </w:tcPr>
     </w:tblStylePr>
@@ -4205,10 +4181,10 @@
       <w:tblPr/>
       <w:tcPr>
         <w:tcBorders>
-          <w:top w:val="single" w:sz="8" w:space="0" w:color="4F81BD" w:themeColor="accent1"/>
-          <w:left w:val="single" w:sz="8" w:space="0" w:color="4F81BD" w:themeColor="accent1"/>
-          <w:bottom w:val="single" w:sz="8" w:space="0" w:color="4F81BD" w:themeColor="accent1"/>
-          <w:right w:val="single" w:sz="8" w:space="0" w:color="4F81BD" w:themeColor="accent1"/>
+          <w:top w:val="single" w:sz="8" w:space="0" w:color="000000"/>
+          <w:left w:val="single" w:sz="8" w:space="0" w:color="000000"/>
+          <w:bottom w:val="single" w:sz="8" w:space="0" w:color="000000"/>
+          <w:right w:val="single" w:sz="8" w:space="0" w:color="000000"/>
         </w:tcBorders>
       </w:tcPr>
     </w:tblStylePr>
@@ -4663,7 +4639,7 @@
         <w:spacing w:before="0" w:after="0" w:line="240" w:lineRule="auto"/>
       </w:pPr>
       <w:rPr>
-        <w:rFonts w:asciiTheme="majorHAnsi" w:eastAsiaTheme="majorEastAsia" w:hAnsiTheme="majorHAnsi" w:cstheme="majorBidi"/>
+        <w:rFonts w:ascii="Times New Roman" w:hAnsi="Times New Roman" w:cs="Times New Roman" w:eastAsia="Times New Roman"/>
         <w:b/>
         <w:bCs/>
       </w:rPr>
@@ -4684,7 +4660,7 @@
         <w:spacing w:before="0" w:after="0" w:line="240" w:lineRule="auto"/>
       </w:pPr>
       <w:rPr>
-        <w:rFonts w:asciiTheme="majorHAnsi" w:eastAsiaTheme="majorEastAsia" w:hAnsiTheme="majorHAnsi" w:cstheme="majorBidi"/>
+        <w:rFonts w:ascii="Times New Roman" w:hAnsi="Times New Roman" w:cs="Times New Roman" w:eastAsia="Times New Roman"/>
         <w:b/>
         <w:bCs/>
       </w:rPr>
@@ -4702,14 +4678,14 @@
     </w:tblStylePr>
     <w:tblStylePr w:type="firstCol">
       <w:rPr>
-        <w:rFonts w:asciiTheme="majorHAnsi" w:eastAsiaTheme="majorEastAsia" w:hAnsiTheme="majorHAnsi" w:cstheme="majorBidi"/>
+        <w:rFonts w:ascii="Times New Roman" w:hAnsi="Times New Roman" w:cs="Times New Roman" w:eastAsia="Times New Roman"/>
         <w:b/>
         <w:bCs/>
       </w:rPr>
     </w:tblStylePr>
     <w:tblStylePr w:type="lastCol">
       <w:rPr>
-        <w:rFonts w:asciiTheme="majorHAnsi" w:eastAsiaTheme="majorEastAsia" w:hAnsiTheme="majorHAnsi" w:cstheme="majorBidi"/>
+        <w:rFonts w:ascii="Times New Roman" w:hAnsi="Times New Roman" w:cs="Times New Roman" w:eastAsia="Times New Roman"/>
         <w:b/>
         <w:bCs/>
       </w:rPr>
@@ -4773,12 +4749,12 @@
       <w:tblStyleRowBandSize w:val="1"/>
       <w:tblStyleColBandSize w:val="1"/>
       <w:tblBorders>
-        <w:top w:val="single" w:sz="8" w:space="0" w:color="4F81BD" w:themeColor="accent1"/>
-        <w:left w:val="single" w:sz="8" w:space="0" w:color="4F81BD" w:themeColor="accent1"/>
-        <w:bottom w:val="single" w:sz="8" w:space="0" w:color="4F81BD" w:themeColor="accent1"/>
-        <w:right w:val="single" w:sz="8" w:space="0" w:color="4F81BD" w:themeColor="accent1"/>
-        <w:insideH w:val="single" w:sz="8" w:space="0" w:color="4F81BD" w:themeColor="accent1"/>
-        <w:insideV w:val="single" w:sz="8" w:space="0" w:color="4F81BD" w:themeColor="accent1"/>
+        <w:top w:val="single" w:sz="8" w:space="0" w:color="000000"/>
+        <w:left w:val="single" w:sz="8" w:space="0" w:color="000000"/>
+        <w:bottom w:val="single" w:sz="8" w:space="0" w:color="000000"/>
+        <w:right w:val="single" w:sz="8" w:space="0" w:color="000000"/>
+        <w:insideH w:val="single" w:sz="8" w:space="0" w:color="000000"/>
+        <w:insideV w:val="single" w:sz="8" w:space="0" w:color="000000"/>
       </w:tblBorders>
     </w:tblPr>
     <w:tblStylePr w:type="firstRow">
@@ -4786,19 +4762,19 @@
         <w:spacing w:before="0" w:after="0" w:line="240" w:lineRule="auto"/>
       </w:pPr>
       <w:rPr>
-        <w:rFonts w:asciiTheme="majorHAnsi" w:eastAsiaTheme="majorEastAsia" w:hAnsiTheme="majorHAnsi" w:cstheme="majorBidi"/>
-        <w:b/>
-        <w:bCs/>
-      </w:rPr>
-      <w:tblPr/>
-      <w:tcPr>
-        <w:tcBorders>
-          <w:top w:val="single" w:sz="8" w:space="0" w:color="4F81BD" w:themeColor="accent1"/>
-          <w:left w:val="single" w:sz="8" w:space="0" w:color="4F81BD" w:themeColor="accent1"/>
-          <w:bottom w:val="single" w:sz="18" w:space="0" w:color="4F81BD" w:themeColor="accent1"/>
-          <w:right w:val="single" w:sz="8" w:space="0" w:color="4F81BD" w:themeColor="accent1"/>
-          <w:insideH w:val="nil"/>
-          <w:insideV w:val="single" w:sz="8" w:space="0" w:color="4F81BD" w:themeColor="accent1"/>
+        <w:rFonts w:ascii="Times New Roman" w:hAnsi="Times New Roman" w:cs="Times New Roman" w:eastAsia="Times New Roman"/>
+        <w:b/>
+        <w:bCs/>
+      </w:rPr>
+      <w:tblPr/>
+      <w:tcPr>
+        <w:tcBorders>
+          <w:top w:val="single" w:sz="8" w:space="0" w:color="000000"/>
+          <w:left w:val="single" w:sz="8" w:space="0" w:color="000000"/>
+          <w:bottom w:val="single" w:sz="18" w:space="0" w:color="000000"/>
+          <w:right w:val="single" w:sz="8" w:space="0" w:color="000000"/>
+          <w:insideH w:val="nil"/>
+          <w:insideV w:val="single" w:sz="8" w:space="0" w:color="000000"/>
         </w:tcBorders>
       </w:tcPr>
     </w:tblStylePr>
@@ -4807,42 +4783,42 @@
         <w:spacing w:before="0" w:after="0" w:line="240" w:lineRule="auto"/>
       </w:pPr>
       <w:rPr>
-        <w:rFonts w:asciiTheme="majorHAnsi" w:eastAsiaTheme="majorEastAsia" w:hAnsiTheme="majorHAnsi" w:cstheme="majorBidi"/>
-        <w:b/>
-        <w:bCs/>
-      </w:rPr>
-      <w:tblPr/>
-      <w:tcPr>
-        <w:tcBorders>
-          <w:top w:val="double" w:sz="6" w:space="0" w:color="4F81BD" w:themeColor="accent1"/>
-          <w:left w:val="single" w:sz="8" w:space="0" w:color="4F81BD" w:themeColor="accent1"/>
-          <w:bottom w:val="single" w:sz="8" w:space="0" w:color="4F81BD" w:themeColor="accent1"/>
-          <w:right w:val="single" w:sz="8" w:space="0" w:color="4F81BD" w:themeColor="accent1"/>
-          <w:insideH w:val="nil"/>
-          <w:insideV w:val="single" w:sz="8" w:space="0" w:color="4F81BD" w:themeColor="accent1"/>
+        <w:rFonts w:ascii="Times New Roman" w:hAnsi="Times New Roman" w:cs="Times New Roman" w:eastAsia="Times New Roman"/>
+        <w:b/>
+        <w:bCs/>
+      </w:rPr>
+      <w:tblPr/>
+      <w:tcPr>
+        <w:tcBorders>
+          <w:top w:val="double" w:sz="6" w:space="0" w:color="000000"/>
+          <w:left w:val="single" w:sz="8" w:space="0" w:color="000000"/>
+          <w:bottom w:val="single" w:sz="8" w:space="0" w:color="000000"/>
+          <w:right w:val="single" w:sz="8" w:space="0" w:color="000000"/>
+          <w:insideH w:val="nil"/>
+          <w:insideV w:val="single" w:sz="8" w:space="0" w:color="000000"/>
         </w:tcBorders>
       </w:tcPr>
     </w:tblStylePr>
     <w:tblStylePr w:type="firstCol">
       <w:rPr>
-        <w:rFonts w:asciiTheme="majorHAnsi" w:eastAsiaTheme="majorEastAsia" w:hAnsiTheme="majorHAnsi" w:cstheme="majorBidi"/>
+        <w:rFonts w:ascii="Times New Roman" w:hAnsi="Times New Roman" w:cs="Times New Roman" w:eastAsia="Times New Roman"/>
         <w:b/>
         <w:bCs/>
       </w:rPr>
     </w:tblStylePr>
     <w:tblStylePr w:type="lastCol">
       <w:rPr>
-        <w:rFonts w:asciiTheme="majorHAnsi" w:eastAsiaTheme="majorEastAsia" w:hAnsiTheme="majorHAnsi" w:cstheme="majorBidi"/>
-        <w:b/>
-        <w:bCs/>
-      </w:rPr>
-      <w:tblPr/>
-      <w:tcPr>
-        <w:tcBorders>
-          <w:top w:val="single" w:sz="8" w:space="0" w:color="4F81BD" w:themeColor="accent1"/>
-          <w:left w:val="single" w:sz="8" w:space="0" w:color="4F81BD" w:themeColor="accent1"/>
-          <w:bottom w:val="single" w:sz="8" w:space="0" w:color="4F81BD" w:themeColor="accent1"/>
-          <w:right w:val="single" w:sz="8" w:space="0" w:color="4F81BD" w:themeColor="accent1"/>
+        <w:rFonts w:ascii="Times New Roman" w:hAnsi="Times New Roman" w:cs="Times New Roman" w:eastAsia="Times New Roman"/>
+        <w:b/>
+        <w:bCs/>
+      </w:rPr>
+      <w:tblPr/>
+      <w:tcPr>
+        <w:tcBorders>
+          <w:top w:val="single" w:sz="8" w:space="0" w:color="000000"/>
+          <w:left w:val="single" w:sz="8" w:space="0" w:color="000000"/>
+          <w:bottom w:val="single" w:sz="8" w:space="0" w:color="000000"/>
+          <w:right w:val="single" w:sz="8" w:space="0" w:color="000000"/>
         </w:tcBorders>
       </w:tcPr>
     </w:tblStylePr>
@@ -4850,10 +4826,10 @@
       <w:tblPr/>
       <w:tcPr>
         <w:tcBorders>
-          <w:top w:val="single" w:sz="8" w:space="0" w:color="4F81BD" w:themeColor="accent1"/>
-          <w:left w:val="single" w:sz="8" w:space="0" w:color="4F81BD" w:themeColor="accent1"/>
-          <w:bottom w:val="single" w:sz="8" w:space="0" w:color="4F81BD" w:themeColor="accent1"/>
-          <w:right w:val="single" w:sz="8" w:space="0" w:color="4F81BD" w:themeColor="accent1"/>
+          <w:top w:val="single" w:sz="8" w:space="0" w:color="000000"/>
+          <w:left w:val="single" w:sz="8" w:space="0" w:color="000000"/>
+          <w:bottom w:val="single" w:sz="8" w:space="0" w:color="000000"/>
+          <w:right w:val="single" w:sz="8" w:space="0" w:color="000000"/>
         </w:tcBorders>
         <w:shd w:val="clear" w:color="auto" w:fill="D3DFEE" w:themeFill="accent1" w:themeFillTint="3F"/>
       </w:tcPr>
@@ -4862,11 +4838,11 @@
       <w:tblPr/>
       <w:tcPr>
         <w:tcBorders>
-          <w:top w:val="single" w:sz="8" w:space="0" w:color="4F81BD" w:themeColor="accent1"/>
-          <w:left w:val="single" w:sz="8" w:space="0" w:color="4F81BD" w:themeColor="accent1"/>
-          <w:bottom w:val="single" w:sz="8" w:space="0" w:color="4F81BD" w:themeColor="accent1"/>
-          <w:right w:val="single" w:sz="8" w:space="0" w:color="4F81BD" w:themeColor="accent1"/>
-          <w:insideV w:val="single" w:sz="8" w:space="0" w:color="4F81BD" w:themeColor="accent1"/>
+          <w:top w:val="single" w:sz="8" w:space="0" w:color="000000"/>
+          <w:left w:val="single" w:sz="8" w:space="0" w:color="000000"/>
+          <w:bottom w:val="single" w:sz="8" w:space="0" w:color="000000"/>
+          <w:right w:val="single" w:sz="8" w:space="0" w:color="000000"/>
+          <w:insideV w:val="single" w:sz="8" w:space="0" w:color="000000"/>
         </w:tcBorders>
         <w:shd w:val="clear" w:color="auto" w:fill="D3DFEE" w:themeFill="accent1" w:themeFillTint="3F"/>
       </w:tcPr>
@@ -4875,11 +4851,11 @@
       <w:tblPr/>
       <w:tcPr>
         <w:tcBorders>
-          <w:top w:val="single" w:sz="8" w:space="0" w:color="4F81BD" w:themeColor="accent1"/>
-          <w:left w:val="single" w:sz="8" w:space="0" w:color="4F81BD" w:themeColor="accent1"/>
-          <w:bottom w:val="single" w:sz="8" w:space="0" w:color="4F81BD" w:themeColor="accent1"/>
-          <w:right w:val="single" w:sz="8" w:space="0" w:color="4F81BD" w:themeColor="accent1"/>
-          <w:insideV w:val="single" w:sz="8" w:space="0" w:color="4F81BD" w:themeColor="accent1"/>
+          <w:top w:val="single" w:sz="8" w:space="0" w:color="000000"/>
+          <w:left w:val="single" w:sz="8" w:space="0" w:color="000000"/>
+          <w:bottom w:val="single" w:sz="8" w:space="0" w:color="000000"/>
+          <w:right w:val="single" w:sz="8" w:space="0" w:color="000000"/>
+          <w:insideV w:val="single" w:sz="8" w:space="0" w:color="000000"/>
         </w:tcBorders>
       </w:tcPr>
     </w:tblStylePr>
@@ -4909,7 +4885,7 @@
         <w:spacing w:before="0" w:after="0" w:line="240" w:lineRule="auto"/>
       </w:pPr>
       <w:rPr>
-        <w:rFonts w:asciiTheme="majorHAnsi" w:eastAsiaTheme="majorEastAsia" w:hAnsiTheme="majorHAnsi" w:cstheme="majorBidi"/>
+        <w:rFonts w:ascii="Times New Roman" w:hAnsi="Times New Roman" w:cs="Times New Roman" w:eastAsia="Times New Roman"/>
         <w:b/>
         <w:bCs/>
       </w:rPr>
@@ -4930,7 +4906,7 @@
         <w:spacing w:before="0" w:after="0" w:line="240" w:lineRule="auto"/>
       </w:pPr>
       <w:rPr>
-        <w:rFonts w:asciiTheme="majorHAnsi" w:eastAsiaTheme="majorEastAsia" w:hAnsiTheme="majorHAnsi" w:cstheme="majorBidi"/>
+        <w:rFonts w:ascii="Times New Roman" w:hAnsi="Times New Roman" w:cs="Times New Roman" w:eastAsia="Times New Roman"/>
         <w:b/>
         <w:bCs/>
       </w:rPr>
@@ -4948,14 +4924,14 @@
     </w:tblStylePr>
     <w:tblStylePr w:type="firstCol">
       <w:rPr>
-        <w:rFonts w:asciiTheme="majorHAnsi" w:eastAsiaTheme="majorEastAsia" w:hAnsiTheme="majorHAnsi" w:cstheme="majorBidi"/>
+        <w:rFonts w:ascii="Times New Roman" w:hAnsi="Times New Roman" w:cs="Times New Roman" w:eastAsia="Times New Roman"/>
         <w:b/>
         <w:bCs/>
       </w:rPr>
     </w:tblStylePr>
     <w:tblStylePr w:type="lastCol">
       <w:rPr>
-        <w:rFonts w:asciiTheme="majorHAnsi" w:eastAsiaTheme="majorEastAsia" w:hAnsiTheme="majorHAnsi" w:cstheme="majorBidi"/>
+        <w:rFonts w:ascii="Times New Roman" w:hAnsi="Times New Roman" w:cs="Times New Roman" w:eastAsia="Times New Roman"/>
         <w:b/>
         <w:bCs/>
       </w:rPr>
@@ -5032,7 +5008,7 @@
         <w:spacing w:before="0" w:after="0" w:line="240" w:lineRule="auto"/>
       </w:pPr>
       <w:rPr>
-        <w:rFonts w:asciiTheme="majorHAnsi" w:eastAsiaTheme="majorEastAsia" w:hAnsiTheme="majorHAnsi" w:cstheme="majorBidi"/>
+        <w:rFonts w:ascii="Times New Roman" w:hAnsi="Times New Roman" w:cs="Times New Roman" w:eastAsia="Times New Roman"/>
         <w:b/>
         <w:bCs/>
       </w:rPr>
@@ -5053,7 +5029,7 @@
         <w:spacing w:before="0" w:after="0" w:line="240" w:lineRule="auto"/>
       </w:pPr>
       <w:rPr>
-        <w:rFonts w:asciiTheme="majorHAnsi" w:eastAsiaTheme="majorEastAsia" w:hAnsiTheme="majorHAnsi" w:cstheme="majorBidi"/>
+        <w:rFonts w:ascii="Times New Roman" w:hAnsi="Times New Roman" w:cs="Times New Roman" w:eastAsia="Times New Roman"/>
         <w:b/>
         <w:bCs/>
       </w:rPr>
@@ -5071,14 +5047,14 @@
     </w:tblStylePr>
     <w:tblStylePr w:type="firstCol">
       <w:rPr>
-        <w:rFonts w:asciiTheme="majorHAnsi" w:eastAsiaTheme="majorEastAsia" w:hAnsiTheme="majorHAnsi" w:cstheme="majorBidi"/>
+        <w:rFonts w:ascii="Times New Roman" w:hAnsi="Times New Roman" w:cs="Times New Roman" w:eastAsia="Times New Roman"/>
         <w:b/>
         <w:bCs/>
       </w:rPr>
     </w:tblStylePr>
     <w:tblStylePr w:type="lastCol">
       <w:rPr>
-        <w:rFonts w:asciiTheme="majorHAnsi" w:eastAsiaTheme="majorEastAsia" w:hAnsiTheme="majorHAnsi" w:cstheme="majorBidi"/>
+        <w:rFonts w:ascii="Times New Roman" w:hAnsi="Times New Roman" w:cs="Times New Roman" w:eastAsia="Times New Roman"/>
         <w:b/>
         <w:bCs/>
       </w:rPr>
@@ -5155,7 +5131,7 @@
         <w:spacing w:before="0" w:after="0" w:line="240" w:lineRule="auto"/>
       </w:pPr>
       <w:rPr>
-        <w:rFonts w:asciiTheme="majorHAnsi" w:eastAsiaTheme="majorEastAsia" w:hAnsiTheme="majorHAnsi" w:cstheme="majorBidi"/>
+        <w:rFonts w:ascii="Times New Roman" w:hAnsi="Times New Roman" w:cs="Times New Roman" w:eastAsia="Times New Roman"/>
         <w:b/>
         <w:bCs/>
       </w:rPr>
@@ -5176,7 +5152,7 @@
         <w:spacing w:before="0" w:after="0" w:line="240" w:lineRule="auto"/>
       </w:pPr>
       <w:rPr>
-        <w:rFonts w:asciiTheme="majorHAnsi" w:eastAsiaTheme="majorEastAsia" w:hAnsiTheme="majorHAnsi" w:cstheme="majorBidi"/>
+        <w:rFonts w:ascii="Times New Roman" w:hAnsi="Times New Roman" w:cs="Times New Roman" w:eastAsia="Times New Roman"/>
         <w:b/>
         <w:bCs/>
       </w:rPr>
@@ -5194,14 +5170,14 @@
     </w:tblStylePr>
     <w:tblStylePr w:type="firstCol">
       <w:rPr>
-        <w:rFonts w:asciiTheme="majorHAnsi" w:eastAsiaTheme="majorEastAsia" w:hAnsiTheme="majorHAnsi" w:cstheme="majorBidi"/>
+        <w:rFonts w:ascii="Times New Roman" w:hAnsi="Times New Roman" w:cs="Times New Roman" w:eastAsia="Times New Roman"/>
         <w:b/>
         <w:bCs/>
       </w:rPr>
     </w:tblStylePr>
     <w:tblStylePr w:type="lastCol">
       <w:rPr>
-        <w:rFonts w:asciiTheme="majorHAnsi" w:eastAsiaTheme="majorEastAsia" w:hAnsiTheme="majorHAnsi" w:cstheme="majorBidi"/>
+        <w:rFonts w:ascii="Times New Roman" w:hAnsi="Times New Roman" w:cs="Times New Roman" w:eastAsia="Times New Roman"/>
         <w:b/>
         <w:bCs/>
       </w:rPr>
@@ -5278,7 +5254,7 @@
         <w:spacing w:before="0" w:after="0" w:line="240" w:lineRule="auto"/>
       </w:pPr>
       <w:rPr>
-        <w:rFonts w:asciiTheme="majorHAnsi" w:eastAsiaTheme="majorEastAsia" w:hAnsiTheme="majorHAnsi" w:cstheme="majorBidi"/>
+        <w:rFonts w:ascii="Times New Roman" w:hAnsi="Times New Roman" w:cs="Times New Roman" w:eastAsia="Times New Roman"/>
         <w:b/>
         <w:bCs/>
       </w:rPr>
@@ -5299,7 +5275,7 @@
         <w:spacing w:before="0" w:after="0" w:line="240" w:lineRule="auto"/>
       </w:pPr>
       <w:rPr>
-        <w:rFonts w:asciiTheme="majorHAnsi" w:eastAsiaTheme="majorEastAsia" w:hAnsiTheme="majorHAnsi" w:cstheme="majorBidi"/>
+        <w:rFonts w:ascii="Times New Roman" w:hAnsi="Times New Roman" w:cs="Times New Roman" w:eastAsia="Times New Roman"/>
         <w:b/>
         <w:bCs/>
       </w:rPr>
@@ -5317,14 +5293,14 @@
     </w:tblStylePr>
     <w:tblStylePr w:type="firstCol">
       <w:rPr>
-        <w:rFonts w:asciiTheme="majorHAnsi" w:eastAsiaTheme="majorEastAsia" w:hAnsiTheme="majorHAnsi" w:cstheme="majorBidi"/>
+        <w:rFonts w:ascii="Times New Roman" w:hAnsi="Times New Roman" w:cs="Times New Roman" w:eastAsia="Times New Roman"/>
         <w:b/>
         <w:bCs/>
       </w:rPr>
     </w:tblStylePr>
     <w:tblStylePr w:type="lastCol">
       <w:rPr>
-        <w:rFonts w:asciiTheme="majorHAnsi" w:eastAsiaTheme="majorEastAsia" w:hAnsiTheme="majorHAnsi" w:cstheme="majorBidi"/>
+        <w:rFonts w:ascii="Times New Roman" w:hAnsi="Times New Roman" w:cs="Times New Roman" w:eastAsia="Times New Roman"/>
         <w:b/>
         <w:bCs/>
       </w:rPr>
@@ -5401,7 +5377,7 @@
         <w:spacing w:before="0" w:after="0" w:line="240" w:lineRule="auto"/>
       </w:pPr>
       <w:rPr>
-        <w:rFonts w:asciiTheme="majorHAnsi" w:eastAsiaTheme="majorEastAsia" w:hAnsiTheme="majorHAnsi" w:cstheme="majorBidi"/>
+        <w:rFonts w:ascii="Times New Roman" w:hAnsi="Times New Roman" w:cs="Times New Roman" w:eastAsia="Times New Roman"/>
         <w:b/>
         <w:bCs/>
       </w:rPr>
@@ -5422,7 +5398,7 @@
         <w:spacing w:before="0" w:after="0" w:line="240" w:lineRule="auto"/>
       </w:pPr>
       <w:rPr>
-        <w:rFonts w:asciiTheme="majorHAnsi" w:eastAsiaTheme="majorEastAsia" w:hAnsiTheme="majorHAnsi" w:cstheme="majorBidi"/>
+        <w:rFonts w:ascii="Times New Roman" w:hAnsi="Times New Roman" w:cs="Times New Roman" w:eastAsia="Times New Roman"/>
         <w:b/>
         <w:bCs/>
       </w:rPr>
@@ -5440,14 +5416,14 @@
     </w:tblStylePr>
     <w:tblStylePr w:type="firstCol">
       <w:rPr>
-        <w:rFonts w:asciiTheme="majorHAnsi" w:eastAsiaTheme="majorEastAsia" w:hAnsiTheme="majorHAnsi" w:cstheme="majorBidi"/>
+        <w:rFonts w:ascii="Times New Roman" w:hAnsi="Times New Roman" w:cs="Times New Roman" w:eastAsia="Times New Roman"/>
         <w:b/>
         <w:bCs/>
       </w:rPr>
     </w:tblStylePr>
     <w:tblStylePr w:type="lastCol">
       <w:rPr>
-        <w:rFonts w:asciiTheme="majorHAnsi" w:eastAsiaTheme="majorEastAsia" w:hAnsiTheme="majorHAnsi" w:cstheme="majorBidi"/>
+        <w:rFonts w:ascii="Times New Roman" w:hAnsi="Times New Roman" w:cs="Times New Roman" w:eastAsia="Times New Roman"/>
         <w:b/>
         <w:bCs/>
       </w:rPr>
@@ -7207,7 +7183,7 @@
     </w:tblPr>
     <w:tblStylePr w:type="firstRow">
       <w:rPr>
-        <w:rFonts w:asciiTheme="majorHAnsi" w:eastAsiaTheme="majorEastAsia" w:hAnsiTheme="majorHAnsi" w:cstheme="majorBidi"/>
+        <w:rFonts w:ascii="Times New Roman" w:hAnsi="Times New Roman" w:cs="Times New Roman" w:eastAsia="Times New Roman"/>
       </w:rPr>
       <w:tblPr/>
       <w:tcPr>
@@ -7278,19 +7254,19 @@
       <w:tblStyleRowBandSize w:val="1"/>
       <w:tblStyleColBandSize w:val="1"/>
       <w:tblBorders>
-        <w:top w:val="single" w:sz="8" w:space="0" w:color="4F81BD" w:themeColor="accent1"/>
-        <w:bottom w:val="single" w:sz="8" w:space="0" w:color="4F81BD" w:themeColor="accent1"/>
+        <w:top w:val="single" w:sz="8" w:space="0" w:color="000000"/>
+        <w:bottom w:val="single" w:sz="8" w:space="0" w:color="000000"/>
       </w:tblBorders>
     </w:tblPr>
     <w:tblStylePr w:type="firstRow">
       <w:rPr>
-        <w:rFonts w:asciiTheme="majorHAnsi" w:eastAsiaTheme="majorEastAsia" w:hAnsiTheme="majorHAnsi" w:cstheme="majorBidi"/>
+        <w:rFonts w:ascii="Times New Roman" w:hAnsi="Times New Roman" w:cs="Times New Roman" w:eastAsia="Times New Roman"/>
       </w:rPr>
       <w:tblPr/>
       <w:tcPr>
         <w:tcBorders>
           <w:top w:val="nil"/>
-          <w:bottom w:val="single" w:sz="8" w:space="0" w:color="4F81BD" w:themeColor="accent1"/>
+          <w:bottom w:val="single" w:sz="8" w:space="0" w:color="000000"/>
         </w:tcBorders>
       </w:tcPr>
     </w:tblStylePr>
@@ -7303,8 +7279,8 @@
       <w:tblPr/>
       <w:tcPr>
         <w:tcBorders>
-          <w:top w:val="single" w:sz="8" w:space="0" w:color="4F81BD" w:themeColor="accent1"/>
-          <w:bottom w:val="single" w:sz="8" w:space="0" w:color="4F81BD" w:themeColor="accent1"/>
+          <w:top w:val="single" w:sz="8" w:space="0" w:color="000000"/>
+          <w:bottom w:val="single" w:sz="8" w:space="0" w:color="000000"/>
         </w:tcBorders>
       </w:tcPr>
     </w:tblStylePr>
@@ -7322,8 +7298,8 @@
       <w:tblPr/>
       <w:tcPr>
         <w:tcBorders>
-          <w:top w:val="single" w:sz="8" w:space="0" w:color="4F81BD" w:themeColor="accent1"/>
-          <w:bottom w:val="single" w:sz="8" w:space="0" w:color="4F81BD" w:themeColor="accent1"/>
+          <w:top w:val="single" w:sz="8" w:space="0" w:color="000000"/>
+          <w:bottom w:val="single" w:sz="8" w:space="0" w:color="000000"/>
         </w:tcBorders>
       </w:tcPr>
     </w:tblStylePr>
@@ -7361,7 +7337,7 @@
     </w:tblPr>
     <w:tblStylePr w:type="firstRow">
       <w:rPr>
-        <w:rFonts w:asciiTheme="majorHAnsi" w:eastAsiaTheme="majorEastAsia" w:hAnsiTheme="majorHAnsi" w:cstheme="majorBidi"/>
+        <w:rFonts w:ascii="Times New Roman" w:hAnsi="Times New Roman" w:cs="Times New Roman" w:eastAsia="Times New Roman"/>
       </w:rPr>
       <w:tblPr/>
       <w:tcPr>
@@ -7438,7 +7414,7 @@
     </w:tblPr>
     <w:tblStylePr w:type="firstRow">
       <w:rPr>
-        <w:rFonts w:asciiTheme="majorHAnsi" w:eastAsiaTheme="majorEastAsia" w:hAnsiTheme="majorHAnsi" w:cstheme="majorBidi"/>
+        <w:rFonts w:ascii="Times New Roman" w:hAnsi="Times New Roman" w:cs="Times New Roman" w:eastAsia="Times New Roman"/>
       </w:rPr>
       <w:tblPr/>
       <w:tcPr>
@@ -7515,7 +7491,7 @@
     </w:tblPr>
     <w:tblStylePr w:type="firstRow">
       <w:rPr>
-        <w:rFonts w:asciiTheme="majorHAnsi" w:eastAsiaTheme="majorEastAsia" w:hAnsiTheme="majorHAnsi" w:cstheme="majorBidi"/>
+        <w:rFonts w:ascii="Times New Roman" w:hAnsi="Times New Roman" w:cs="Times New Roman" w:eastAsia="Times New Roman"/>
       </w:rPr>
       <w:tblPr/>
       <w:tcPr>
@@ -7592,7 +7568,7 @@
     </w:tblPr>
     <w:tblStylePr w:type="firstRow">
       <w:rPr>
-        <w:rFonts w:asciiTheme="majorHAnsi" w:eastAsiaTheme="majorEastAsia" w:hAnsiTheme="majorHAnsi" w:cstheme="majorBidi"/>
+        <w:rFonts w:ascii="Times New Roman" w:hAnsi="Times New Roman" w:cs="Times New Roman" w:eastAsia="Times New Roman"/>
       </w:rPr>
       <w:tblPr/>
       <w:tcPr>
@@ -7669,7 +7645,7 @@
     </w:tblPr>
     <w:tblStylePr w:type="firstRow">
       <w:rPr>
-        <w:rFonts w:asciiTheme="majorHAnsi" w:eastAsiaTheme="majorEastAsia" w:hAnsiTheme="majorHAnsi" w:cstheme="majorBidi"/>
+        <w:rFonts w:ascii="Times New Roman" w:hAnsi="Times New Roman" w:cs="Times New Roman" w:eastAsia="Times New Roman"/>
       </w:rPr>
       <w:tblPr/>
       <w:tcPr>
@@ -7734,7 +7710,7 @@
       <w:spacing w:after="0" w:line="240" w:lineRule="auto"/>
     </w:pPr>
     <w:rPr>
-      <w:rFonts w:asciiTheme="majorHAnsi" w:eastAsiaTheme="majorEastAsia" w:hAnsiTheme="majorHAnsi" w:cstheme="majorBidi"/>
+      <w:rFonts w:ascii="Times New Roman" w:hAnsi="Times New Roman" w:cs="Times New Roman" w:eastAsia="Times New Roman"/>
       <w:color w:val="000000" w:themeColor="text1"/>
     </w:rPr>
     <w:tblPr>
@@ -7855,17 +7831,17 @@
       <w:spacing w:after="0" w:line="240" w:lineRule="auto"/>
     </w:pPr>
     <w:rPr>
-      <w:rFonts w:asciiTheme="majorHAnsi" w:eastAsiaTheme="majorEastAsia" w:hAnsiTheme="majorHAnsi" w:cstheme="majorBidi"/>
+      <w:rFonts w:ascii="Times New Roman" w:hAnsi="Times New Roman" w:cs="Times New Roman" w:eastAsia="Times New Roman"/>
       <w:color w:val="000000" w:themeColor="text1"/>
     </w:rPr>
     <w:tblPr>
       <w:tblStyleRowBandSize w:val="1"/>
       <w:tblStyleColBandSize w:val="1"/>
       <w:tblBorders>
-        <w:top w:val="single" w:sz="8" w:space="0" w:color="4F81BD" w:themeColor="accent1"/>
-        <w:left w:val="single" w:sz="8" w:space="0" w:color="4F81BD" w:themeColor="accent1"/>
-        <w:bottom w:val="single" w:sz="8" w:space="0" w:color="4F81BD" w:themeColor="accent1"/>
-        <w:right w:val="single" w:sz="8" w:space="0" w:color="4F81BD" w:themeColor="accent1"/>
+        <w:top w:val="single" w:sz="8" w:space="0" w:color="000000"/>
+        <w:left w:val="single" w:sz="8" w:space="0" w:color="000000"/>
+        <w:bottom w:val="single" w:sz="8" w:space="0" w:color="000000"/>
+        <w:right w:val="single" w:sz="8" w:space="0" w:color="000000"/>
       </w:tblBorders>
     </w:tblPr>
     <w:tblStylePr w:type="firstRow">
@@ -7878,7 +7854,7 @@
         <w:tcBorders>
           <w:top w:val="nil"/>
           <w:left w:val="nil"/>
-          <w:bottom w:val="single" w:sz="24" w:space="0" w:color="4F81BD" w:themeColor="accent1"/>
+          <w:bottom w:val="single" w:sz="24" w:space="0" w:color="000000"/>
           <w:right w:val="nil"/>
           <w:insideH w:val="nil"/>
           <w:insideV w:val="nil"/>
@@ -7890,7 +7866,7 @@
       <w:tblPr/>
       <w:tcPr>
         <w:tcBorders>
-          <w:top w:val="single" w:sz="8" w:space="0" w:color="4F81BD" w:themeColor="accent1"/>
+          <w:top w:val="single" w:sz="8" w:space="0" w:color="000000"/>
           <w:left w:val="nil"/>
           <w:bottom w:val="nil"/>
           <w:right w:val="nil"/>
@@ -7907,7 +7883,7 @@
           <w:top w:val="nil"/>
           <w:left w:val="nil"/>
           <w:bottom w:val="nil"/>
-          <w:right w:val="single" w:sz="8" w:space="0" w:color="4F81BD" w:themeColor="accent1"/>
+          <w:right w:val="single" w:sz="8" w:space="0" w:color="000000"/>
           <w:insideH w:val="nil"/>
           <w:insideV w:val="nil"/>
         </w:tcBorders>
@@ -7919,7 +7895,7 @@
       <w:tcPr>
         <w:tcBorders>
           <w:top w:val="nil"/>
-          <w:left w:val="single" w:sz="8" w:space="0" w:color="4F81BD" w:themeColor="accent1"/>
+          <w:left w:val="single" w:sz="8" w:space="0" w:color="000000"/>
           <w:bottom w:val="nil"/>
           <w:right w:val="nil"/>
           <w:insideH w:val="nil"/>
@@ -7976,7 +7952,7 @@
       <w:spacing w:after="0" w:line="240" w:lineRule="auto"/>
     </w:pPr>
     <w:rPr>
-      <w:rFonts w:asciiTheme="majorHAnsi" w:eastAsiaTheme="majorEastAsia" w:hAnsiTheme="majorHAnsi" w:cstheme="majorBidi"/>
+      <w:rFonts w:ascii="Times New Roman" w:hAnsi="Times New Roman" w:cs="Times New Roman" w:eastAsia="Times New Roman"/>
       <w:color w:val="000000" w:themeColor="text1"/>
     </w:rPr>
     <w:tblPr>
@@ -8097,7 +8073,7 @@
       <w:spacing w:after="0" w:line="240" w:lineRule="auto"/>
     </w:pPr>
     <w:rPr>
-      <w:rFonts w:asciiTheme="majorHAnsi" w:eastAsiaTheme="majorEastAsia" w:hAnsiTheme="majorHAnsi" w:cstheme="majorBidi"/>
+      <w:rFonts w:ascii="Times New Roman" w:hAnsi="Times New Roman" w:cs="Times New Roman" w:eastAsia="Times New Roman"/>
       <w:color w:val="000000" w:themeColor="text1"/>
     </w:rPr>
     <w:tblPr>
@@ -8218,7 +8194,7 @@
       <w:spacing w:after="0" w:line="240" w:lineRule="auto"/>
     </w:pPr>
     <w:rPr>
-      <w:rFonts w:asciiTheme="majorHAnsi" w:eastAsiaTheme="majorEastAsia" w:hAnsiTheme="majorHAnsi" w:cstheme="majorBidi"/>
+      <w:rFonts w:ascii="Times New Roman" w:hAnsi="Times New Roman" w:cs="Times New Roman" w:eastAsia="Times New Roman"/>
       <w:color w:val="000000" w:themeColor="text1"/>
     </w:rPr>
     <w:tblPr>
@@ -8339,7 +8315,7 @@
       <w:spacing w:after="0" w:line="240" w:lineRule="auto"/>
     </w:pPr>
     <w:rPr>
-      <w:rFonts w:asciiTheme="majorHAnsi" w:eastAsiaTheme="majorEastAsia" w:hAnsiTheme="majorHAnsi" w:cstheme="majorBidi"/>
+      <w:rFonts w:ascii="Times New Roman" w:hAnsi="Times New Roman" w:cs="Times New Roman" w:eastAsia="Times New Roman"/>
       <w:color w:val="000000" w:themeColor="text1"/>
     </w:rPr>
     <w:tblPr>
@@ -8460,7 +8436,7 @@
       <w:spacing w:after="0" w:line="240" w:lineRule="auto"/>
     </w:pPr>
     <w:rPr>
-      <w:rFonts w:asciiTheme="majorHAnsi" w:eastAsiaTheme="majorEastAsia" w:hAnsiTheme="majorHAnsi" w:cstheme="majorBidi"/>
+      <w:rFonts w:ascii="Times New Roman" w:hAnsi="Times New Roman" w:cs="Times New Roman" w:eastAsia="Times New Roman"/>
       <w:color w:val="000000" w:themeColor="text1"/>
     </w:rPr>
     <w:tblPr>
@@ -9043,7 +9019,7 @@
       <w:spacing w:after="0" w:line="240" w:lineRule="auto"/>
     </w:pPr>
     <w:rPr>
-      <w:rFonts w:asciiTheme="majorHAnsi" w:eastAsiaTheme="majorEastAsia" w:hAnsiTheme="majorHAnsi" w:cstheme="majorBidi"/>
+      <w:rFonts w:ascii="Times New Roman" w:hAnsi="Times New Roman" w:cs="Times New Roman" w:eastAsia="Times New Roman"/>
       <w:color w:val="000000" w:themeColor="text1"/>
     </w:rPr>
     <w:tblPr>
@@ -9161,19 +9137,19 @@
       <w:spacing w:after="0" w:line="240" w:lineRule="auto"/>
     </w:pPr>
     <w:rPr>
-      <w:rFonts w:asciiTheme="majorHAnsi" w:eastAsiaTheme="majorEastAsia" w:hAnsiTheme="majorHAnsi" w:cstheme="majorBidi"/>
+      <w:rFonts w:ascii="Times New Roman" w:hAnsi="Times New Roman" w:cs="Times New Roman" w:eastAsia="Times New Roman"/>
       <w:color w:val="000000" w:themeColor="text1"/>
     </w:rPr>
     <w:tblPr>
       <w:tblStyleRowBandSize w:val="1"/>
       <w:tblStyleColBandSize w:val="1"/>
       <w:tblBorders>
-        <w:top w:val="single" w:sz="8" w:space="0" w:color="4F81BD" w:themeColor="accent1"/>
-        <w:left w:val="single" w:sz="8" w:space="0" w:color="4F81BD" w:themeColor="accent1"/>
-        <w:bottom w:val="single" w:sz="8" w:space="0" w:color="4F81BD" w:themeColor="accent1"/>
-        <w:right w:val="single" w:sz="8" w:space="0" w:color="4F81BD" w:themeColor="accent1"/>
-        <w:insideH w:val="single" w:sz="8" w:space="0" w:color="4F81BD" w:themeColor="accent1"/>
-        <w:insideV w:val="single" w:sz="8" w:space="0" w:color="4F81BD" w:themeColor="accent1"/>
+        <w:top w:val="single" w:sz="8" w:space="0" w:color="000000"/>
+        <w:left w:val="single" w:sz="8" w:space="0" w:color="000000"/>
+        <w:bottom w:val="single" w:sz="8" w:space="0" w:color="000000"/>
+        <w:right w:val="single" w:sz="8" w:space="0" w:color="000000"/>
+        <w:insideH w:val="single" w:sz="8" w:space="0" w:color="000000"/>
+        <w:insideV w:val="single" w:sz="8" w:space="0" w:color="000000"/>
       </w:tblBorders>
     </w:tblPr>
     <w:tcPr>
@@ -9257,8 +9233,8 @@
       <w:tblPr/>
       <w:tcPr>
         <w:tcBorders>
-          <w:insideH w:val="single" w:sz="6" w:space="0" w:color="4F81BD" w:themeColor="accent1"/>
-          <w:insideV w:val="single" w:sz="6" w:space="0" w:color="4F81BD" w:themeColor="accent1"/>
+          <w:insideH w:val="single" w:sz="6" w:space="0" w:color="000000"/>
+          <w:insideV w:val="single" w:sz="6" w:space="0" w:color="000000"/>
         </w:tcBorders>
         <w:shd w:val="clear" w:color="auto" w:fill="A7BFDE" w:themeFill="accent1" w:themeFillTint="7F"/>
       </w:tcPr>
@@ -9279,7 +9255,7 @@
       <w:spacing w:after="0" w:line="240" w:lineRule="auto"/>
     </w:pPr>
     <w:rPr>
-      <w:rFonts w:asciiTheme="majorHAnsi" w:eastAsiaTheme="majorEastAsia" w:hAnsiTheme="majorHAnsi" w:cstheme="majorBidi"/>
+      <w:rFonts w:ascii="Times New Roman" w:hAnsi="Times New Roman" w:cs="Times New Roman" w:eastAsia="Times New Roman"/>
       <w:color w:val="000000" w:themeColor="text1"/>
     </w:rPr>
     <w:tblPr>
@@ -9397,7 +9373,7 @@
       <w:spacing w:after="0" w:line="240" w:lineRule="auto"/>
     </w:pPr>
     <w:rPr>
-      <w:rFonts w:asciiTheme="majorHAnsi" w:eastAsiaTheme="majorEastAsia" w:hAnsiTheme="majorHAnsi" w:cstheme="majorBidi"/>
+      <w:rFonts w:ascii="Times New Roman" w:hAnsi="Times New Roman" w:cs="Times New Roman" w:eastAsia="Times New Roman"/>
       <w:color w:val="000000" w:themeColor="text1"/>
     </w:rPr>
     <w:tblPr>
@@ -9515,7 +9491,7 @@
       <w:spacing w:after="0" w:line="240" w:lineRule="auto"/>
     </w:pPr>
     <w:rPr>
-      <w:rFonts w:asciiTheme="majorHAnsi" w:eastAsiaTheme="majorEastAsia" w:hAnsiTheme="majorHAnsi" w:cstheme="majorBidi"/>
+      <w:rFonts w:ascii="Times New Roman" w:hAnsi="Times New Roman" w:cs="Times New Roman" w:eastAsia="Times New Roman"/>
       <w:color w:val="000000" w:themeColor="text1"/>
     </w:rPr>
     <w:tblPr>
@@ -9633,7 +9609,7 @@
       <w:spacing w:after="0" w:line="240" w:lineRule="auto"/>
     </w:pPr>
     <w:rPr>
-      <w:rFonts w:asciiTheme="majorHAnsi" w:eastAsiaTheme="majorEastAsia" w:hAnsiTheme="majorHAnsi" w:cstheme="majorBidi"/>
+      <w:rFonts w:ascii="Times New Roman" w:hAnsi="Times New Roman" w:cs="Times New Roman" w:eastAsia="Times New Roman"/>
       <w:color w:val="000000" w:themeColor="text1"/>
     </w:rPr>
     <w:tblPr>
@@ -9751,7 +9727,7 @@
       <w:spacing w:after="0" w:line="240" w:lineRule="auto"/>
     </w:pPr>
     <w:rPr>
-      <w:rFonts w:asciiTheme="majorHAnsi" w:eastAsiaTheme="majorEastAsia" w:hAnsiTheme="majorHAnsi" w:cstheme="majorBidi"/>
+      <w:rFonts w:ascii="Times New Roman" w:hAnsi="Times New Roman" w:cs="Times New Roman" w:eastAsia="Times New Roman"/>
       <w:color w:val="000000" w:themeColor="text1"/>
     </w:rPr>
     <w:tblPr>
@@ -11678,9 +11654,9 @@
       <w:tblStyleColBandSize w:val="1"/>
       <w:tblBorders>
         <w:top w:val="single" w:sz="24" w:space="0" w:color="C0504D" w:themeColor="accent2"/>
-        <w:left w:val="single" w:sz="4" w:space="0" w:color="4F81BD" w:themeColor="accent1"/>
-        <w:bottom w:val="single" w:sz="4" w:space="0" w:color="4F81BD" w:themeColor="accent1"/>
-        <w:right w:val="single" w:sz="4" w:space="0" w:color="4F81BD" w:themeColor="accent1"/>
+        <w:left w:val="single" w:sz="4" w:space="0" w:color="000000"/>
+        <w:bottom w:val="single" w:sz="4" w:space="0" w:color="000000"/>
+        <w:right w:val="single" w:sz="4" w:space="0" w:color="000000"/>
         <w:insideH w:val="single" w:sz="4" w:space="0" w:color="FFFFFF" w:themeColor="background1"/>
         <w:insideV w:val="single" w:sz="4" w:space="0" w:color="FFFFFF" w:themeColor="background1"/>
       </w:tblBorders>
@@ -13452,7 +13428,7 @@
     </a:clrScheme>
     <a:fontScheme name="Office">
       <a:majorFont>
-        <a:latin typeface="Calibri"/>
+        <a:latin typeface="Times New Roman"/>
         <a:ea typeface=""/>
         <a:cs typeface=""/>
         <a:font script="Jpan" typeface="ＭＳ ゴシック"/>
@@ -13487,7 +13463,7 @@
         <a:font script="Geor" typeface="Sylfaen"/>
       </a:majorFont>
       <a:minorFont>
-        <a:latin typeface="Cambria"/>
+        <a:latin typeface="Times New Roman"/>
         <a:ea typeface=""/>
         <a:cs typeface=""/>
         <a:font script="Jpan" typeface="ＭＳ 明朝"/>

</xml_diff>

<commit_message>
Update all documents: clean photos, 220 uF capacitor, header-pin wiring, circuit label
Co-Authored-By: Claude Opus 5.5 <noreply@anthropic.com>
Claude-Session: https://claude.ai/code/session_01RBCZvHRngDWn2z2Egxvtcp
</commit_message>
<xml_diff>
--- a/docs/VisionGuard_Project_Report.docx
+++ b/docs/VisionGuard_Project_Report.docx
@@ -1356,7 +1356,7 @@
               <w:rPr>
                 <w:sz w:val="20"/>
               </w:rPr>
-              <w:t xml:space="preserve">220–470 µF supply filter</w:t>
+              <w:t xml:space="preserve">220 µF, 50 V supply filter</w:t>
             </w:r>
           </w:p>
         </w:tc>
@@ -1427,7 +1427,7 @@
       <w:r>
         <w:drawing>
           <wp:inline distT="0" distB="0" distL="0" distR="0">
-            <wp:extent cx="5486400" cy="4130475"/>
+            <wp:extent cx="2880360" cy="3840480"/>
             <wp:docPr id="104" name="Picture 104"/>
             <wp:cNvGraphicFramePr>
               <a:graphicFrameLocks xmlns:a="http://schemas.openxmlformats.org/drawingml/2006/main" noChangeAspect="1"/>
@@ -1448,7 +1448,7 @@
                   <pic:spPr>
                     <a:xfrm>
                       <a:off x="0" y="0"/>
-                      <a:ext cx="5486400" cy="4130475"/>
+                      <a:ext cx="2880360" cy="3840480"/>
                     </a:xfrm>
                     <a:prstGeom prst="rect">
                       <a:avLst/>
@@ -1469,7 +1469,7 @@
       <w:r>
         <w:drawing>
           <wp:inline distT="0" distB="0" distL="0" distR="0">
-            <wp:extent cx="2793518" cy="2103120"/>
+            <wp:extent cx="1714500" cy="2286000"/>
             <wp:docPr id="105" name="Picture 105"/>
             <wp:cNvGraphicFramePr>
               <a:graphicFrameLocks xmlns:a="http://schemas.openxmlformats.org/drawingml/2006/main" noChangeAspect="1"/>
@@ -1490,7 +1490,7 @@
                   <pic:spPr>
                     <a:xfrm>
                       <a:off x="0" y="0"/>
-                      <a:ext cx="2793518" cy="2103120"/>
+                      <a:ext cx="1714500" cy="2286000"/>
                     </a:xfrm>
                     <a:prstGeom prst="rect">
                       <a:avLst/>
@@ -1508,7 +1508,7 @@
       <w:r>
         <w:drawing>
           <wp:inline distT="0" distB="0" distL="0" distR="0">
-            <wp:extent cx="1583845" cy="2103120"/>
+            <wp:extent cx="1721031" cy="2286000"/>
             <wp:docPr id="106" name="Picture 106"/>
             <wp:cNvGraphicFramePr>
               <a:graphicFrameLocks xmlns:a="http://schemas.openxmlformats.org/drawingml/2006/main" noChangeAspect="1"/>
@@ -1529,7 +1529,7 @@
                   <pic:spPr>
                     <a:xfrm>
                       <a:off x="0" y="0"/>
-                      <a:ext cx="1583845" cy="2103120"/>
+                      <a:ext cx="1721031" cy="2286000"/>
                     </a:xfrm>
                     <a:prstGeom prst="rect">
                       <a:avLst/>
@@ -1547,7 +1547,7 @@
         <w:jc w:val="center"/>
       </w:pPr>
       <w:r>
-        <w:t xml:space="preserve">Figure 4. Photograph of the completed project. Top: LM393 module, HC-SR04 sensor and Arduino Nano with buzzer and switch mounted on the PVC cane. Bottom left: moisture probe at the tip. Bottom right: 18650 cell in its holder.</w:t>
+        <w:t xml:space="preserve">Figure 4. Photograph of the completed project. Top: the complete cane, with the moisture probe at the top end, then the LM393 module, HC-SR04 sensor, Arduino Nano with buzzer and 220 µF capacitor, rocker switch and 18650 battery. Bottom left: moisture probe at the tip. Bottom right: rocker switch and battery holder.</w:t>
       </w:r>
     </w:p>
     <w:p>

</xml_diff>